<commit_message>
docs: Update Prioritised list of UC
</commit_message>
<xml_diff>
--- a/Documentation/Prioritised list of UC.docx
+++ b/Documentation/Prioritised list of UC.docx
@@ -241,7 +241,31 @@
                 <w:sz w:val="22"/>
                 <w:szCs w:val="22"/>
               </w:rPr>
-              <w:t>Users must browse available products/services before any transaction can occur.</w:t>
+              <w:t>This is essential as u</w:t>
+            </w:r>
+            <w:r>
+              <w:rPr>
+                <w:rFonts w:ascii="Times Roman" w:hAnsi="Times Roman"/>
+                <w:sz w:val="22"/>
+                <w:szCs w:val="22"/>
+              </w:rPr>
+              <w:t>sers must browse available products</w:t>
+            </w:r>
+            <w:r>
+              <w:rPr>
+                <w:rFonts w:ascii="Times Roman" w:hAnsi="Times Roman"/>
+                <w:sz w:val="22"/>
+                <w:szCs w:val="22"/>
+              </w:rPr>
+              <w:t xml:space="preserve"> </w:t>
+            </w:r>
+            <w:r>
+              <w:rPr>
+                <w:rFonts w:ascii="Times Roman" w:hAnsi="Times Roman"/>
+                <w:sz w:val="22"/>
+                <w:szCs w:val="22"/>
+              </w:rPr>
+              <w:t>services before any transaction can occur.</w:t>
             </w:r>
           </w:p>
         </w:tc>
@@ -358,7 +382,63 @@
                 <w:sz w:val="22"/>
                 <w:szCs w:val="22"/>
               </w:rPr>
-              <w:t>Detailed item information is required for informed purchasing decisions.</w:t>
+              <w:t>This functionality allows users to view d</w:t>
+            </w:r>
+            <w:r>
+              <w:rPr>
+                <w:rFonts w:ascii="Times Roman" w:hAnsi="Times Roman"/>
+                <w:sz w:val="22"/>
+                <w:szCs w:val="22"/>
+              </w:rPr>
+              <w:t xml:space="preserve">etailed </w:t>
+            </w:r>
+            <w:r>
+              <w:rPr>
+                <w:rFonts w:ascii="Times Roman" w:hAnsi="Times Roman"/>
+                <w:sz w:val="22"/>
+                <w:szCs w:val="22"/>
+              </w:rPr>
+              <w:t xml:space="preserve">product </w:t>
+            </w:r>
+            <w:r>
+              <w:rPr>
+                <w:rFonts w:ascii="Times Roman" w:hAnsi="Times Roman"/>
+                <w:sz w:val="22"/>
+                <w:szCs w:val="22"/>
+              </w:rPr>
+              <w:t>information</w:t>
+            </w:r>
+            <w:r>
+              <w:rPr>
+                <w:rFonts w:ascii="Times Roman" w:hAnsi="Times Roman"/>
+                <w:sz w:val="22"/>
+                <w:szCs w:val="22"/>
+              </w:rPr>
+              <w:t xml:space="preserve">. It </w:t>
+            </w:r>
+            <w:r>
+              <w:rPr>
+                <w:rFonts w:ascii="Times Roman" w:hAnsi="Times Roman"/>
+                <w:sz w:val="22"/>
+                <w:szCs w:val="22"/>
+              </w:rPr>
+              <w:t xml:space="preserve">is </w:t>
+            </w:r>
+            <w:r>
+              <w:rPr>
+                <w:rFonts w:ascii="Times Roman" w:hAnsi="Times Roman"/>
+                <w:sz w:val="22"/>
+                <w:szCs w:val="22"/>
+              </w:rPr>
+              <w:t>essential</w:t>
+            </w:r>
+            <w:r>
+              <w:rPr>
+                <w:rFonts w:ascii="Times Roman" w:hAnsi="Times Roman"/>
+                <w:sz w:val="22"/>
+                <w:szCs w:val="22"/>
+              </w:rPr>
+              <w:t xml:space="preserve"> for informed purchasing decisions.</w:t>
             </w:r>
           </w:p>
         </w:tc>
@@ -477,7 +557,7 @@
                   <w14:bevel/>
                 </w14:textOutline>
               </w:rPr>
-              <w:t>Core business function enabling revenue generation.</w:t>
+              <w:t>Allows customers to purchase products through the system.</w:t>
             </w:r>
           </w:p>
         </w:tc>
@@ -594,9 +674,8 @@
                   <w14:bevel/>
                 </w14:textOutline>
               </w:rPr>
-              <w:t xml:space="preserve">Required to </w:t>
-            </w:r>
-            <w:proofErr w:type="spellStart"/>
+              <w:t>This is essential as it</w:t>
+            </w:r>
             <w:r>
               <w:rPr>
                 <w:rFonts w:eastAsia="Aptos" w:cs="Aptos"/>
@@ -610,9 +689,8 @@
                   <w14:bevel/>
                 </w14:textOutline>
               </w:rPr>
-              <w:t>finalise</w:t>
-            </w:r>
-            <w:proofErr w:type="spellEnd"/>
+              <w:t xml:space="preserve"> i</w:t>
+            </w:r>
             <w:r>
               <w:rPr>
                 <w:rFonts w:eastAsia="Aptos" w:cs="Aptos"/>
@@ -626,112 +704,8 @@
                   <w14:bevel/>
                 </w14:textOutline>
               </w:rPr>
-              <w:t xml:space="preserve"> purchases and confirm order submission.</w:t>
-            </w:r>
-          </w:p>
-        </w:tc>
-      </w:tr>
-      <w:tr>
-        <w:trPr>
-          <w:trHeight w:val="241"/>
-        </w:trPr>
-        <w:tc>
-          <w:tcPr>
-            <w:tcW w:w="1179" w:type="dxa"/>
-            <w:tcBorders>
-              <w:top w:val="single" w:sz="4" w:space="0" w:color="000000"/>
-              <w:left w:val="single" w:sz="4" w:space="0" w:color="000000"/>
-              <w:bottom w:val="single" w:sz="4" w:space="0" w:color="000000"/>
-              <w:right w:val="single" w:sz="4" w:space="0" w:color="000000"/>
-            </w:tcBorders>
-            <w:tcMar>
-              <w:top w:w="80" w:type="dxa"/>
-              <w:left w:w="80" w:type="dxa"/>
-              <w:bottom w:w="80" w:type="dxa"/>
-              <w:right w:w="80" w:type="dxa"/>
-            </w:tcMar>
-          </w:tcPr>
-          <w:p>
-            <w:pPr>
-              <w:pStyle w:val="BodyText"/>
-            </w:pPr>
-            <w:r>
-              <w:t>UC05</w:t>
-            </w:r>
-          </w:p>
-        </w:tc>
-        <w:tc>
-          <w:tcPr>
-            <w:tcW w:w="3161" w:type="dxa"/>
-            <w:tcBorders>
-              <w:top w:val="single" w:sz="4" w:space="0" w:color="000000"/>
-              <w:left w:val="single" w:sz="4" w:space="0" w:color="000000"/>
-              <w:bottom w:val="single" w:sz="4" w:space="0" w:color="000000"/>
-              <w:right w:val="single" w:sz="4" w:space="0" w:color="000000"/>
-            </w:tcBorders>
-            <w:tcMar>
-              <w:top w:w="80" w:type="dxa"/>
-              <w:left w:w="80" w:type="dxa"/>
-              <w:bottom w:w="80" w:type="dxa"/>
-              <w:right w:w="80" w:type="dxa"/>
-            </w:tcMar>
-          </w:tcPr>
-          <w:p>
-            <w:pPr>
-              <w:pStyle w:val="BodyText"/>
-            </w:pPr>
-            <w:proofErr w:type="spellStart"/>
-            <w:r>
-              <w:t>RegisterAccount</w:t>
-            </w:r>
-            <w:proofErr w:type="spellEnd"/>
-          </w:p>
-        </w:tc>
-        <w:tc>
-          <w:tcPr>
-            <w:tcW w:w="1467" w:type="dxa"/>
-            <w:tcBorders>
-              <w:top w:val="single" w:sz="4" w:space="0" w:color="000000"/>
-              <w:left w:val="single" w:sz="4" w:space="0" w:color="000000"/>
-              <w:bottom w:val="single" w:sz="4" w:space="0" w:color="000000"/>
-              <w:right w:val="single" w:sz="4" w:space="0" w:color="000000"/>
-            </w:tcBorders>
-            <w:tcMar>
-              <w:top w:w="80" w:type="dxa"/>
-              <w:left w:w="80" w:type="dxa"/>
-              <w:bottom w:w="80" w:type="dxa"/>
-              <w:right w:w="80" w:type="dxa"/>
-            </w:tcMar>
-          </w:tcPr>
-          <w:p>
-            <w:pPr>
-              <w:pStyle w:val="BodyText"/>
-            </w:pPr>
-            <w:r>
-              <w:t>Essential</w:t>
-            </w:r>
-          </w:p>
-        </w:tc>
-        <w:tc>
-          <w:tcPr>
-            <w:tcW w:w="3209" w:type="dxa"/>
-            <w:tcBorders>
-              <w:top w:val="single" w:sz="4" w:space="0" w:color="000000"/>
-              <w:left w:val="single" w:sz="4" w:space="0" w:color="000000"/>
-              <w:bottom w:val="single" w:sz="4" w:space="0" w:color="000000"/>
-              <w:right w:val="single" w:sz="4" w:space="0" w:color="000000"/>
-            </w:tcBorders>
-            <w:tcMar>
-              <w:top w:w="80" w:type="dxa"/>
-              <w:left w:w="80" w:type="dxa"/>
-              <w:bottom w:w="80" w:type="dxa"/>
-              <w:right w:w="80" w:type="dxa"/>
-            </w:tcMar>
-          </w:tcPr>
-          <w:p>
-            <w:pPr>
-              <w:spacing w:after="240"/>
-            </w:pPr>
+              <w:t>s r</w:t>
+            </w:r>
             <w:r>
               <w:rPr>
                 <w:rFonts w:eastAsia="Aptos" w:cs="Aptos"/>
@@ -745,7 +719,7 @@
                   <w14:bevel/>
                 </w14:textOutline>
               </w:rPr>
-              <w:t xml:space="preserve">Enables user identification, order tracking, and </w:t>
+              <w:t xml:space="preserve">equired to </w:t>
             </w:r>
             <w:proofErr w:type="spellStart"/>
             <w:r>
@@ -761,7 +735,7 @@
                   <w14:bevel/>
                 </w14:textOutline>
               </w:rPr>
-              <w:t>personalised</w:t>
+              <w:t>finalise</w:t>
             </w:r>
             <w:proofErr w:type="spellEnd"/>
             <w:r>
@@ -777,110 +751,8 @@
                   <w14:bevel/>
                 </w14:textOutline>
               </w:rPr>
-              <w:t xml:space="preserve"> services.</w:t>
-            </w:r>
-          </w:p>
-        </w:tc>
-      </w:tr>
-      <w:tr>
-        <w:trPr>
-          <w:trHeight w:val="241"/>
-        </w:trPr>
-        <w:tc>
-          <w:tcPr>
-            <w:tcW w:w="1179" w:type="dxa"/>
-            <w:tcBorders>
-              <w:top w:val="single" w:sz="4" w:space="0" w:color="000000"/>
-              <w:left w:val="single" w:sz="4" w:space="0" w:color="000000"/>
-              <w:bottom w:val="single" w:sz="4" w:space="0" w:color="000000"/>
-              <w:right w:val="single" w:sz="4" w:space="0" w:color="000000"/>
-            </w:tcBorders>
-            <w:tcMar>
-              <w:top w:w="80" w:type="dxa"/>
-              <w:left w:w="80" w:type="dxa"/>
-              <w:bottom w:w="80" w:type="dxa"/>
-              <w:right w:w="80" w:type="dxa"/>
-            </w:tcMar>
-          </w:tcPr>
-          <w:p>
-            <w:pPr>
-              <w:pStyle w:val="BodyText"/>
-            </w:pPr>
-            <w:r>
-              <w:t>UC06</w:t>
-            </w:r>
-          </w:p>
-        </w:tc>
-        <w:tc>
-          <w:tcPr>
-            <w:tcW w:w="3161" w:type="dxa"/>
-            <w:tcBorders>
-              <w:top w:val="single" w:sz="4" w:space="0" w:color="000000"/>
-              <w:left w:val="single" w:sz="4" w:space="0" w:color="000000"/>
-              <w:bottom w:val="single" w:sz="4" w:space="0" w:color="000000"/>
-              <w:right w:val="single" w:sz="4" w:space="0" w:color="000000"/>
-            </w:tcBorders>
-            <w:tcMar>
-              <w:top w:w="80" w:type="dxa"/>
-              <w:left w:w="80" w:type="dxa"/>
-              <w:bottom w:w="80" w:type="dxa"/>
-              <w:right w:w="80" w:type="dxa"/>
-            </w:tcMar>
-          </w:tcPr>
-          <w:p>
-            <w:pPr>
-              <w:pStyle w:val="BodyText"/>
-            </w:pPr>
-            <w:r>
-              <w:t>Login</w:t>
-            </w:r>
-          </w:p>
-        </w:tc>
-        <w:tc>
-          <w:tcPr>
-            <w:tcW w:w="1467" w:type="dxa"/>
-            <w:tcBorders>
-              <w:top w:val="single" w:sz="4" w:space="0" w:color="000000"/>
-              <w:left w:val="single" w:sz="4" w:space="0" w:color="000000"/>
-              <w:bottom w:val="single" w:sz="4" w:space="0" w:color="000000"/>
-              <w:right w:val="single" w:sz="4" w:space="0" w:color="000000"/>
-            </w:tcBorders>
-            <w:tcMar>
-              <w:top w:w="80" w:type="dxa"/>
-              <w:left w:w="80" w:type="dxa"/>
-              <w:bottom w:w="80" w:type="dxa"/>
-              <w:right w:w="80" w:type="dxa"/>
-            </w:tcMar>
-          </w:tcPr>
-          <w:p>
-            <w:pPr>
-              <w:pStyle w:val="BodyText"/>
-            </w:pPr>
-            <w:r>
-              <w:t>Important</w:t>
-            </w:r>
-          </w:p>
-        </w:tc>
-        <w:tc>
-          <w:tcPr>
-            <w:tcW w:w="3209" w:type="dxa"/>
-            <w:tcBorders>
-              <w:top w:val="single" w:sz="4" w:space="0" w:color="000000"/>
-              <w:left w:val="single" w:sz="4" w:space="0" w:color="000000"/>
-              <w:bottom w:val="single" w:sz="4" w:space="0" w:color="000000"/>
-              <w:right w:val="single" w:sz="4" w:space="0" w:color="000000"/>
-            </w:tcBorders>
-            <w:tcMar>
-              <w:top w:w="80" w:type="dxa"/>
-              <w:left w:w="80" w:type="dxa"/>
-              <w:bottom w:w="80" w:type="dxa"/>
-              <w:right w:w="80" w:type="dxa"/>
-            </w:tcMar>
-          </w:tcPr>
-          <w:p>
-            <w:pPr>
-              <w:spacing w:after="240"/>
-            </w:pPr>
+              <w:t xml:space="preserve"> purchases and confirm order submission.</w:t>
+            </w:r>
             <w:r>
               <w:rPr>
                 <w:rFonts w:eastAsia="Aptos" w:cs="Aptos"/>
@@ -894,7 +766,7 @@
                   <w14:bevel/>
                 </w14:textOutline>
               </w:rPr>
-              <w:t>Allows returning users to access accounts and stored information securely.</w:t>
+              <w:t xml:space="preserve"> </w:t>
             </w:r>
           </w:p>
         </w:tc>
@@ -924,7 +796,7 @@
               <w:pStyle w:val="BodyText"/>
             </w:pPr>
             <w:r>
-              <w:t>UC07</w:t>
+              <w:t>UC05</w:t>
             </w:r>
           </w:p>
         </w:tc>
@@ -948,9 +820,11 @@
             <w:pPr>
               <w:pStyle w:val="BodyText"/>
             </w:pPr>
-            <w:r>
-              <w:t>Logout</w:t>
-            </w:r>
+            <w:proofErr w:type="spellStart"/>
+            <w:r>
+              <w:t>RegisterAccount</w:t>
+            </w:r>
+            <w:proofErr w:type="spellEnd"/>
           </w:p>
         </w:tc>
         <w:tc>
@@ -974,7 +848,7 @@
               <w:pStyle w:val="BodyText"/>
             </w:pPr>
             <w:r>
-              <w:t>Good to have</w:t>
+              <w:t>Essential</w:t>
             </w:r>
           </w:p>
         </w:tc>
@@ -1011,110 +885,8 @@
                   <w14:bevel/>
                 </w14:textOutline>
               </w:rPr>
-              <w:t>Improves session security but system can still operate without explicit logout.</w:t>
-            </w:r>
-          </w:p>
-        </w:tc>
-      </w:tr>
-      <w:tr>
-        <w:trPr>
-          <w:trHeight w:val="241"/>
-        </w:trPr>
-        <w:tc>
-          <w:tcPr>
-            <w:tcW w:w="1179" w:type="dxa"/>
-            <w:tcBorders>
-              <w:top w:val="single" w:sz="4" w:space="0" w:color="000000"/>
-              <w:left w:val="single" w:sz="4" w:space="0" w:color="000000"/>
-              <w:bottom w:val="single" w:sz="4" w:space="0" w:color="000000"/>
-              <w:right w:val="single" w:sz="4" w:space="0" w:color="000000"/>
-            </w:tcBorders>
-            <w:tcMar>
-              <w:top w:w="80" w:type="dxa"/>
-              <w:left w:w="80" w:type="dxa"/>
-              <w:bottom w:w="80" w:type="dxa"/>
-              <w:right w:w="80" w:type="dxa"/>
-            </w:tcMar>
-          </w:tcPr>
-          <w:p>
-            <w:pPr>
-              <w:pStyle w:val="BodyText"/>
-            </w:pPr>
-            <w:r>
-              <w:t>UC08</w:t>
-            </w:r>
-          </w:p>
-        </w:tc>
-        <w:tc>
-          <w:tcPr>
-            <w:tcW w:w="3161" w:type="dxa"/>
-            <w:tcBorders>
-              <w:top w:val="single" w:sz="4" w:space="0" w:color="000000"/>
-              <w:left w:val="single" w:sz="4" w:space="0" w:color="000000"/>
-              <w:bottom w:val="single" w:sz="4" w:space="0" w:color="000000"/>
-              <w:right w:val="single" w:sz="4" w:space="0" w:color="000000"/>
-            </w:tcBorders>
-            <w:tcMar>
-              <w:top w:w="80" w:type="dxa"/>
-              <w:left w:w="80" w:type="dxa"/>
-              <w:bottom w:w="80" w:type="dxa"/>
-              <w:right w:w="80" w:type="dxa"/>
-            </w:tcMar>
-          </w:tcPr>
-          <w:p>
-            <w:pPr>
-              <w:pStyle w:val="BodyText"/>
-            </w:pPr>
-            <w:r>
-              <w:t>Validate</w:t>
-            </w:r>
-          </w:p>
-        </w:tc>
-        <w:tc>
-          <w:tcPr>
-            <w:tcW w:w="1467" w:type="dxa"/>
-            <w:tcBorders>
-              <w:top w:val="single" w:sz="4" w:space="0" w:color="000000"/>
-              <w:left w:val="single" w:sz="4" w:space="0" w:color="000000"/>
-              <w:bottom w:val="single" w:sz="4" w:space="0" w:color="000000"/>
-              <w:right w:val="single" w:sz="4" w:space="0" w:color="000000"/>
-            </w:tcBorders>
-            <w:tcMar>
-              <w:top w:w="80" w:type="dxa"/>
-              <w:left w:w="80" w:type="dxa"/>
-              <w:bottom w:w="80" w:type="dxa"/>
-              <w:right w:w="80" w:type="dxa"/>
-            </w:tcMar>
-          </w:tcPr>
-          <w:p>
-            <w:pPr>
-              <w:pStyle w:val="BodyText"/>
-            </w:pPr>
-            <w:r>
-              <w:t>Essential</w:t>
-            </w:r>
-          </w:p>
-        </w:tc>
-        <w:tc>
-          <w:tcPr>
-            <w:tcW w:w="3209" w:type="dxa"/>
-            <w:tcBorders>
-              <w:top w:val="single" w:sz="4" w:space="0" w:color="000000"/>
-              <w:left w:val="single" w:sz="4" w:space="0" w:color="000000"/>
-              <w:bottom w:val="single" w:sz="4" w:space="0" w:color="000000"/>
-              <w:right w:val="single" w:sz="4" w:space="0" w:color="000000"/>
-            </w:tcBorders>
-            <w:tcMar>
-              <w:top w:w="80" w:type="dxa"/>
-              <w:left w:w="80" w:type="dxa"/>
-              <w:bottom w:w="80" w:type="dxa"/>
-              <w:right w:w="80" w:type="dxa"/>
-            </w:tcMar>
-          </w:tcPr>
-          <w:p>
-            <w:pPr>
-              <w:spacing w:after="240"/>
-            </w:pPr>
+              <w:t xml:space="preserve">This functionality allows commercial and non-commercial users to create an account. This is essential for authentication, </w:t>
+            </w:r>
             <w:r>
               <w:rPr>
                 <w:rFonts w:eastAsia="Aptos" w:cs="Aptos"/>
@@ -1128,112 +900,8 @@
                   <w14:bevel/>
                 </w14:textOutline>
               </w:rPr>
-              <w:t>Input validation ensures data accuracy, prevents errors, and maintains system integrity.</w:t>
-            </w:r>
-          </w:p>
-        </w:tc>
-      </w:tr>
-      <w:tr>
-        <w:trPr>
-          <w:trHeight w:val="241"/>
-        </w:trPr>
-        <w:tc>
-          <w:tcPr>
-            <w:tcW w:w="1179" w:type="dxa"/>
-            <w:tcBorders>
-              <w:top w:val="single" w:sz="4" w:space="0" w:color="000000"/>
-              <w:left w:val="single" w:sz="4" w:space="0" w:color="000000"/>
-              <w:bottom w:val="single" w:sz="4" w:space="0" w:color="000000"/>
-              <w:right w:val="single" w:sz="4" w:space="0" w:color="000000"/>
-            </w:tcBorders>
-            <w:tcMar>
-              <w:top w:w="80" w:type="dxa"/>
-              <w:left w:w="80" w:type="dxa"/>
-              <w:bottom w:w="80" w:type="dxa"/>
-              <w:right w:w="80" w:type="dxa"/>
-            </w:tcMar>
-          </w:tcPr>
-          <w:p>
-            <w:pPr>
-              <w:pStyle w:val="BodyText"/>
-            </w:pPr>
-            <w:r>
-              <w:t>UC09</w:t>
-            </w:r>
-          </w:p>
-        </w:tc>
-        <w:tc>
-          <w:tcPr>
-            <w:tcW w:w="3161" w:type="dxa"/>
-            <w:tcBorders>
-              <w:top w:val="single" w:sz="4" w:space="0" w:color="000000"/>
-              <w:left w:val="single" w:sz="4" w:space="0" w:color="000000"/>
-              <w:bottom w:val="single" w:sz="4" w:space="0" w:color="000000"/>
-              <w:right w:val="single" w:sz="4" w:space="0" w:color="000000"/>
-            </w:tcBorders>
-            <w:tcMar>
-              <w:top w:w="80" w:type="dxa"/>
-              <w:left w:w="80" w:type="dxa"/>
-              <w:bottom w:w="80" w:type="dxa"/>
-              <w:right w:w="80" w:type="dxa"/>
-            </w:tcMar>
-          </w:tcPr>
-          <w:p>
-            <w:pPr>
-              <w:pStyle w:val="BodyText"/>
-            </w:pPr>
-            <w:proofErr w:type="spellStart"/>
-            <w:r>
-              <w:t>RegisterCommercialAccount</w:t>
-            </w:r>
-            <w:proofErr w:type="spellEnd"/>
-          </w:p>
-        </w:tc>
-        <w:tc>
-          <w:tcPr>
-            <w:tcW w:w="1467" w:type="dxa"/>
-            <w:tcBorders>
-              <w:top w:val="single" w:sz="4" w:space="0" w:color="000000"/>
-              <w:left w:val="single" w:sz="4" w:space="0" w:color="000000"/>
-              <w:bottom w:val="single" w:sz="4" w:space="0" w:color="000000"/>
-              <w:right w:val="single" w:sz="4" w:space="0" w:color="000000"/>
-            </w:tcBorders>
-            <w:tcMar>
-              <w:top w:w="80" w:type="dxa"/>
-              <w:left w:w="80" w:type="dxa"/>
-              <w:bottom w:w="80" w:type="dxa"/>
-              <w:right w:w="80" w:type="dxa"/>
-            </w:tcMar>
-          </w:tcPr>
-          <w:p>
-            <w:pPr>
-              <w:pStyle w:val="BodyText"/>
-            </w:pPr>
-            <w:r>
-              <w:t>Important</w:t>
-            </w:r>
-          </w:p>
-        </w:tc>
-        <w:tc>
-          <w:tcPr>
-            <w:tcW w:w="3209" w:type="dxa"/>
-            <w:tcBorders>
-              <w:top w:val="single" w:sz="4" w:space="0" w:color="000000"/>
-              <w:left w:val="single" w:sz="4" w:space="0" w:color="000000"/>
-              <w:bottom w:val="single" w:sz="4" w:space="0" w:color="000000"/>
-              <w:right w:val="single" w:sz="4" w:space="0" w:color="000000"/>
-            </w:tcBorders>
-            <w:tcMar>
-              <w:top w:w="80" w:type="dxa"/>
-              <w:left w:w="80" w:type="dxa"/>
-              <w:bottom w:w="80" w:type="dxa"/>
-              <w:right w:w="80" w:type="dxa"/>
-            </w:tcMar>
-          </w:tcPr>
-          <w:p>
-            <w:pPr>
-              <w:spacing w:after="240"/>
-            </w:pPr>
+              <w:t xml:space="preserve">order tracking and </w:t>
+            </w:r>
             <w:r>
               <w:rPr>
                 <w:rFonts w:eastAsia="Aptos" w:cs="Aptos"/>
@@ -1247,7 +915,7 @@
                   <w14:bevel/>
                 </w14:textOutline>
               </w:rPr>
-              <w:t>Supports business customers, expanding system usage but not blocking core retail use.</w:t>
+              <w:t>accessing member specific features.</w:t>
             </w:r>
           </w:p>
         </w:tc>
@@ -1277,7 +945,7 @@
               <w:pStyle w:val="BodyText"/>
             </w:pPr>
             <w:r>
-              <w:t>UC10</w:t>
+              <w:t>UC06</w:t>
             </w:r>
           </w:p>
         </w:tc>
@@ -1301,11 +969,9 @@
             <w:pPr>
               <w:pStyle w:val="BodyText"/>
             </w:pPr>
-            <w:proofErr w:type="spellStart"/>
-            <w:r>
-              <w:t>RegisterNonCommercialAccount</w:t>
-            </w:r>
-            <w:proofErr w:type="spellEnd"/>
+            <w:r>
+              <w:t>Login</w:t>
+            </w:r>
           </w:p>
         </w:tc>
         <w:tc>
@@ -1366,112 +1032,8 @@
                   <w14:bevel/>
                 </w14:textOutline>
               </w:rPr>
-              <w:t>Enables standard customer onboarding for account-based purchases.</w:t>
-            </w:r>
-          </w:p>
-        </w:tc>
-      </w:tr>
-      <w:tr>
-        <w:trPr>
-          <w:trHeight w:val="241"/>
-        </w:trPr>
-        <w:tc>
-          <w:tcPr>
-            <w:tcW w:w="1179" w:type="dxa"/>
-            <w:tcBorders>
-              <w:top w:val="single" w:sz="4" w:space="0" w:color="000000"/>
-              <w:left w:val="single" w:sz="4" w:space="0" w:color="000000"/>
-              <w:bottom w:val="single" w:sz="4" w:space="0" w:color="000000"/>
-              <w:right w:val="single" w:sz="4" w:space="0" w:color="000000"/>
-            </w:tcBorders>
-            <w:tcMar>
-              <w:top w:w="80" w:type="dxa"/>
-              <w:left w:w="80" w:type="dxa"/>
-              <w:bottom w:w="80" w:type="dxa"/>
-              <w:right w:w="80" w:type="dxa"/>
-            </w:tcMar>
-          </w:tcPr>
-          <w:p>
-            <w:pPr>
-              <w:pStyle w:val="BodyText"/>
-            </w:pPr>
-            <w:r>
-              <w:t>UC11</w:t>
-            </w:r>
-          </w:p>
-        </w:tc>
-        <w:tc>
-          <w:tcPr>
-            <w:tcW w:w="3161" w:type="dxa"/>
-            <w:tcBorders>
-              <w:top w:val="single" w:sz="4" w:space="0" w:color="000000"/>
-              <w:left w:val="single" w:sz="4" w:space="0" w:color="000000"/>
-              <w:bottom w:val="single" w:sz="4" w:space="0" w:color="000000"/>
-              <w:right w:val="single" w:sz="4" w:space="0" w:color="000000"/>
-            </w:tcBorders>
-            <w:tcMar>
-              <w:top w:w="80" w:type="dxa"/>
-              <w:left w:w="80" w:type="dxa"/>
-              <w:bottom w:w="80" w:type="dxa"/>
-              <w:right w:w="80" w:type="dxa"/>
-            </w:tcMar>
-          </w:tcPr>
-          <w:p>
-            <w:pPr>
-              <w:pStyle w:val="BodyText"/>
-            </w:pPr>
-            <w:proofErr w:type="spellStart"/>
-            <w:r>
-              <w:t>ValidateDetails</w:t>
-            </w:r>
-            <w:proofErr w:type="spellEnd"/>
-          </w:p>
-        </w:tc>
-        <w:tc>
-          <w:tcPr>
-            <w:tcW w:w="1467" w:type="dxa"/>
-            <w:tcBorders>
-              <w:top w:val="single" w:sz="4" w:space="0" w:color="000000"/>
-              <w:left w:val="single" w:sz="4" w:space="0" w:color="000000"/>
-              <w:bottom w:val="single" w:sz="4" w:space="0" w:color="000000"/>
-              <w:right w:val="single" w:sz="4" w:space="0" w:color="000000"/>
-            </w:tcBorders>
-            <w:tcMar>
-              <w:top w:w="80" w:type="dxa"/>
-              <w:left w:w="80" w:type="dxa"/>
-              <w:bottom w:w="80" w:type="dxa"/>
-              <w:right w:w="80" w:type="dxa"/>
-            </w:tcMar>
-          </w:tcPr>
-          <w:p>
-            <w:pPr>
-              <w:pStyle w:val="BodyText"/>
-            </w:pPr>
-            <w:r>
-              <w:t>Important</w:t>
-            </w:r>
-          </w:p>
-        </w:tc>
-        <w:tc>
-          <w:tcPr>
-            <w:tcW w:w="3209" w:type="dxa"/>
-            <w:tcBorders>
-              <w:top w:val="single" w:sz="4" w:space="0" w:color="000000"/>
-              <w:left w:val="single" w:sz="4" w:space="0" w:color="000000"/>
-              <w:bottom w:val="single" w:sz="4" w:space="0" w:color="000000"/>
-              <w:right w:val="single" w:sz="4" w:space="0" w:color="000000"/>
-            </w:tcBorders>
-            <w:tcMar>
-              <w:top w:w="80" w:type="dxa"/>
-              <w:left w:w="80" w:type="dxa"/>
-              <w:bottom w:w="80" w:type="dxa"/>
-              <w:right w:w="80" w:type="dxa"/>
-            </w:tcMar>
-          </w:tcPr>
-          <w:p>
-            <w:pPr>
-              <w:spacing w:after="240"/>
-            </w:pPr>
+              <w:t>Important as it a</w:t>
+            </w:r>
             <w:r>
               <w:rPr>
                 <w:rFonts w:eastAsia="Aptos" w:cs="Aptos"/>
@@ -1485,112 +1047,8 @@
                   <w14:bevel/>
                 </w14:textOutline>
               </w:rPr>
-              <w:t>Ensures user-submitted data correctness, reducing operational errors.</w:t>
-            </w:r>
-          </w:p>
-        </w:tc>
-      </w:tr>
-      <w:tr>
-        <w:trPr>
-          <w:trHeight w:val="241"/>
-        </w:trPr>
-        <w:tc>
-          <w:tcPr>
-            <w:tcW w:w="1179" w:type="dxa"/>
-            <w:tcBorders>
-              <w:top w:val="single" w:sz="4" w:space="0" w:color="000000"/>
-              <w:left w:val="single" w:sz="4" w:space="0" w:color="000000"/>
-              <w:bottom w:val="single" w:sz="4" w:space="0" w:color="000000"/>
-              <w:right w:val="single" w:sz="4" w:space="0" w:color="000000"/>
-            </w:tcBorders>
-            <w:tcMar>
-              <w:top w:w="80" w:type="dxa"/>
-              <w:left w:w="80" w:type="dxa"/>
-              <w:bottom w:w="80" w:type="dxa"/>
-              <w:right w:w="80" w:type="dxa"/>
-            </w:tcMar>
-          </w:tcPr>
-          <w:p>
-            <w:pPr>
-              <w:pStyle w:val="BodyText"/>
-            </w:pPr>
-            <w:r>
-              <w:t>UC12</w:t>
-            </w:r>
-          </w:p>
-        </w:tc>
-        <w:tc>
-          <w:tcPr>
-            <w:tcW w:w="3161" w:type="dxa"/>
-            <w:tcBorders>
-              <w:top w:val="single" w:sz="4" w:space="0" w:color="000000"/>
-              <w:left w:val="single" w:sz="4" w:space="0" w:color="000000"/>
-              <w:bottom w:val="single" w:sz="4" w:space="0" w:color="000000"/>
-              <w:right w:val="single" w:sz="4" w:space="0" w:color="000000"/>
-            </w:tcBorders>
-            <w:tcMar>
-              <w:top w:w="80" w:type="dxa"/>
-              <w:left w:w="80" w:type="dxa"/>
-              <w:bottom w:w="80" w:type="dxa"/>
-              <w:right w:w="80" w:type="dxa"/>
-            </w:tcMar>
-          </w:tcPr>
-          <w:p>
-            <w:pPr>
-              <w:pStyle w:val="BodyText"/>
-            </w:pPr>
-            <w:proofErr w:type="spellStart"/>
-            <w:r>
-              <w:t>SMTP_Notification</w:t>
-            </w:r>
-            <w:proofErr w:type="spellEnd"/>
-          </w:p>
-        </w:tc>
-        <w:tc>
-          <w:tcPr>
-            <w:tcW w:w="1467" w:type="dxa"/>
-            <w:tcBorders>
-              <w:top w:val="single" w:sz="4" w:space="0" w:color="000000"/>
-              <w:left w:val="single" w:sz="4" w:space="0" w:color="000000"/>
-              <w:bottom w:val="single" w:sz="4" w:space="0" w:color="000000"/>
-              <w:right w:val="single" w:sz="4" w:space="0" w:color="000000"/>
-            </w:tcBorders>
-            <w:tcMar>
-              <w:top w:w="80" w:type="dxa"/>
-              <w:left w:w="80" w:type="dxa"/>
-              <w:bottom w:w="80" w:type="dxa"/>
-              <w:right w:w="80" w:type="dxa"/>
-            </w:tcMar>
-          </w:tcPr>
-          <w:p>
-            <w:pPr>
-              <w:pStyle w:val="BodyText"/>
-            </w:pPr>
-            <w:r>
-              <w:t>Important</w:t>
-            </w:r>
-          </w:p>
-        </w:tc>
-        <w:tc>
-          <w:tcPr>
-            <w:tcW w:w="3209" w:type="dxa"/>
-            <w:tcBorders>
-              <w:top w:val="single" w:sz="4" w:space="0" w:color="000000"/>
-              <w:left w:val="single" w:sz="4" w:space="0" w:color="000000"/>
-              <w:bottom w:val="single" w:sz="4" w:space="0" w:color="000000"/>
-              <w:right w:val="single" w:sz="4" w:space="0" w:color="000000"/>
-            </w:tcBorders>
-            <w:tcMar>
-              <w:top w:w="80" w:type="dxa"/>
-              <w:left w:w="80" w:type="dxa"/>
-              <w:bottom w:w="80" w:type="dxa"/>
-              <w:right w:w="80" w:type="dxa"/>
-            </w:tcMar>
-          </w:tcPr>
-          <w:p>
-            <w:pPr>
-              <w:spacing w:after="240"/>
-            </w:pPr>
+              <w:t>llows re</w:t>
+            </w:r>
             <w:r>
               <w:rPr>
                 <w:rFonts w:eastAsia="Aptos" w:cs="Aptos"/>
@@ -1604,7 +1062,7 @@
                   <w14:bevel/>
                 </w14:textOutline>
               </w:rPr>
-              <w:t xml:space="preserve">Provides transaction confirmations and user </w:t>
+              <w:t xml:space="preserve">gistered </w:t>
             </w:r>
             <w:r>
               <w:rPr>
@@ -1619,8 +1077,7 @@
                   <w14:bevel/>
                 </w14:textOutline>
               </w:rPr>
-              <w:lastRenderedPageBreak/>
-              <w:t>communications improving reliability.</w:t>
+              <w:t>users to access accounts and stored information securely.</w:t>
             </w:r>
           </w:p>
         </w:tc>
@@ -1650,8 +1107,7 @@
               <w:pStyle w:val="BodyText"/>
             </w:pPr>
             <w:r>
-              <w:lastRenderedPageBreak/>
-              <w:t>UC13</w:t>
+              <w:t>UC07</w:t>
             </w:r>
           </w:p>
         </w:tc>
@@ -1675,11 +1131,9 @@
             <w:pPr>
               <w:pStyle w:val="BodyText"/>
             </w:pPr>
-            <w:proofErr w:type="spellStart"/>
-            <w:r>
-              <w:t>PromptPasswordChange</w:t>
-            </w:r>
-            <w:proofErr w:type="spellEnd"/>
+            <w:r>
+              <w:t>Logout</w:t>
+            </w:r>
           </w:p>
         </w:tc>
         <w:tc>
@@ -1740,7 +1194,7 @@
                   <w14:bevel/>
                 </w14:textOutline>
               </w:rPr>
-              <w:t>Enhances long-term security but not required for core operations.</w:t>
+              <w:t>Improves session security but system can still operate without explicit logout.</w:t>
             </w:r>
           </w:p>
         </w:tc>
@@ -1770,7 +1224,7 @@
               <w:pStyle w:val="BodyText"/>
             </w:pPr>
             <w:r>
-              <w:t>UC14</w:t>
+              <w:t>UC08</w:t>
             </w:r>
           </w:p>
         </w:tc>
@@ -1794,11 +1248,9 @@
             <w:pPr>
               <w:pStyle w:val="BodyText"/>
             </w:pPr>
-            <w:proofErr w:type="spellStart"/>
-            <w:r>
-              <w:t>EditUserDetails</w:t>
-            </w:r>
-            <w:proofErr w:type="spellEnd"/>
+            <w:r>
+              <w:t>Validate</w:t>
+            </w:r>
           </w:p>
         </w:tc>
         <w:tc>
@@ -1822,7 +1274,7 @@
               <w:pStyle w:val="BodyText"/>
             </w:pPr>
             <w:r>
-              <w:t>Good to have</w:t>
+              <w:t>Essential</w:t>
             </w:r>
           </w:p>
         </w:tc>
@@ -1859,112 +1311,8 @@
                   <w14:bevel/>
                 </w14:textOutline>
               </w:rPr>
-              <w:t>Improves usability by allowing profile updates but not critical for purchases.</w:t>
-            </w:r>
-          </w:p>
-        </w:tc>
-      </w:tr>
-      <w:tr>
-        <w:trPr>
-          <w:trHeight w:val="241"/>
-        </w:trPr>
-        <w:tc>
-          <w:tcPr>
-            <w:tcW w:w="1179" w:type="dxa"/>
-            <w:tcBorders>
-              <w:top w:val="single" w:sz="4" w:space="0" w:color="000000"/>
-              <w:left w:val="single" w:sz="4" w:space="0" w:color="000000"/>
-              <w:bottom w:val="single" w:sz="4" w:space="0" w:color="000000"/>
-              <w:right w:val="single" w:sz="4" w:space="0" w:color="000000"/>
-            </w:tcBorders>
-            <w:tcMar>
-              <w:top w:w="80" w:type="dxa"/>
-              <w:left w:w="80" w:type="dxa"/>
-              <w:bottom w:w="80" w:type="dxa"/>
-              <w:right w:w="80" w:type="dxa"/>
-            </w:tcMar>
-          </w:tcPr>
-          <w:p>
-            <w:pPr>
-              <w:pStyle w:val="BodyText"/>
-            </w:pPr>
-            <w:r>
-              <w:t>UC15</w:t>
-            </w:r>
-          </w:p>
-        </w:tc>
-        <w:tc>
-          <w:tcPr>
-            <w:tcW w:w="3161" w:type="dxa"/>
-            <w:tcBorders>
-              <w:top w:val="single" w:sz="4" w:space="0" w:color="000000"/>
-              <w:left w:val="single" w:sz="4" w:space="0" w:color="000000"/>
-              <w:bottom w:val="single" w:sz="4" w:space="0" w:color="000000"/>
-              <w:right w:val="single" w:sz="4" w:space="0" w:color="000000"/>
-            </w:tcBorders>
-            <w:tcMar>
-              <w:top w:w="80" w:type="dxa"/>
-              <w:left w:w="80" w:type="dxa"/>
-              <w:bottom w:w="80" w:type="dxa"/>
-              <w:right w:w="80" w:type="dxa"/>
-            </w:tcMar>
-          </w:tcPr>
-          <w:p>
-            <w:pPr>
-              <w:pStyle w:val="BodyText"/>
-            </w:pPr>
-            <w:proofErr w:type="spellStart"/>
-            <w:r>
-              <w:t>ChangePassword</w:t>
-            </w:r>
-            <w:proofErr w:type="spellEnd"/>
-          </w:p>
-        </w:tc>
-        <w:tc>
-          <w:tcPr>
-            <w:tcW w:w="1467" w:type="dxa"/>
-            <w:tcBorders>
-              <w:top w:val="single" w:sz="4" w:space="0" w:color="000000"/>
-              <w:left w:val="single" w:sz="4" w:space="0" w:color="000000"/>
-              <w:bottom w:val="single" w:sz="4" w:space="0" w:color="000000"/>
-              <w:right w:val="single" w:sz="4" w:space="0" w:color="000000"/>
-            </w:tcBorders>
-            <w:tcMar>
-              <w:top w:w="80" w:type="dxa"/>
-              <w:left w:w="80" w:type="dxa"/>
-              <w:bottom w:w="80" w:type="dxa"/>
-              <w:right w:w="80" w:type="dxa"/>
-            </w:tcMar>
-          </w:tcPr>
-          <w:p>
-            <w:pPr>
-              <w:pStyle w:val="BodyText"/>
-            </w:pPr>
-            <w:r>
-              <w:t>Good to have</w:t>
-            </w:r>
-          </w:p>
-        </w:tc>
-        <w:tc>
-          <w:tcPr>
-            <w:tcW w:w="3209" w:type="dxa"/>
-            <w:tcBorders>
-              <w:top w:val="single" w:sz="4" w:space="0" w:color="000000"/>
-              <w:left w:val="single" w:sz="4" w:space="0" w:color="000000"/>
-              <w:bottom w:val="single" w:sz="4" w:space="0" w:color="000000"/>
-              <w:right w:val="single" w:sz="4" w:space="0" w:color="000000"/>
-            </w:tcBorders>
-            <w:tcMar>
-              <w:top w:w="80" w:type="dxa"/>
-              <w:left w:w="80" w:type="dxa"/>
-              <w:bottom w:w="80" w:type="dxa"/>
-              <w:right w:w="80" w:type="dxa"/>
-            </w:tcMar>
-          </w:tcPr>
-          <w:p>
-            <w:pPr>
-              <w:spacing w:after="240"/>
-            </w:pPr>
+              <w:t>This functionality is essential for verifying commercial users. It ensures i</w:t>
+            </w:r>
             <w:r>
               <w:rPr>
                 <w:rFonts w:eastAsia="Aptos" w:cs="Aptos"/>
@@ -1978,112 +1326,8 @@
                   <w14:bevel/>
                 </w14:textOutline>
               </w:rPr>
-              <w:t>Security enhancement allowing users to maintain account protection.</w:t>
-            </w:r>
-          </w:p>
-        </w:tc>
-      </w:tr>
-      <w:tr>
-        <w:trPr>
-          <w:trHeight w:val="241"/>
-        </w:trPr>
-        <w:tc>
-          <w:tcPr>
-            <w:tcW w:w="1179" w:type="dxa"/>
-            <w:tcBorders>
-              <w:top w:val="single" w:sz="4" w:space="0" w:color="000000"/>
-              <w:left w:val="single" w:sz="4" w:space="0" w:color="000000"/>
-              <w:bottom w:val="single" w:sz="4" w:space="0" w:color="000000"/>
-              <w:right w:val="single" w:sz="4" w:space="0" w:color="000000"/>
-            </w:tcBorders>
-            <w:tcMar>
-              <w:top w:w="80" w:type="dxa"/>
-              <w:left w:w="80" w:type="dxa"/>
-              <w:bottom w:w="80" w:type="dxa"/>
-              <w:right w:w="80" w:type="dxa"/>
-            </w:tcMar>
-          </w:tcPr>
-          <w:p>
-            <w:pPr>
-              <w:pStyle w:val="BodyText"/>
-            </w:pPr>
-            <w:r>
-              <w:t>UC16</w:t>
-            </w:r>
-          </w:p>
-        </w:tc>
-        <w:tc>
-          <w:tcPr>
-            <w:tcW w:w="3161" w:type="dxa"/>
-            <w:tcBorders>
-              <w:top w:val="single" w:sz="4" w:space="0" w:color="000000"/>
-              <w:left w:val="single" w:sz="4" w:space="0" w:color="000000"/>
-              <w:bottom w:val="single" w:sz="4" w:space="0" w:color="000000"/>
-              <w:right w:val="single" w:sz="4" w:space="0" w:color="000000"/>
-            </w:tcBorders>
-            <w:tcMar>
-              <w:top w:w="80" w:type="dxa"/>
-              <w:left w:w="80" w:type="dxa"/>
-              <w:bottom w:w="80" w:type="dxa"/>
-              <w:right w:w="80" w:type="dxa"/>
-            </w:tcMar>
-          </w:tcPr>
-          <w:p>
-            <w:pPr>
-              <w:pStyle w:val="BodyText"/>
-            </w:pPr>
-            <w:proofErr w:type="spellStart"/>
-            <w:r>
-              <w:t>AddToCart</w:t>
-            </w:r>
-            <w:proofErr w:type="spellEnd"/>
-          </w:p>
-        </w:tc>
-        <w:tc>
-          <w:tcPr>
-            <w:tcW w:w="1467" w:type="dxa"/>
-            <w:tcBorders>
-              <w:top w:val="single" w:sz="4" w:space="0" w:color="000000"/>
-              <w:left w:val="single" w:sz="4" w:space="0" w:color="000000"/>
-              <w:bottom w:val="single" w:sz="4" w:space="0" w:color="000000"/>
-              <w:right w:val="single" w:sz="4" w:space="0" w:color="000000"/>
-            </w:tcBorders>
-            <w:tcMar>
-              <w:top w:w="80" w:type="dxa"/>
-              <w:left w:w="80" w:type="dxa"/>
-              <w:bottom w:w="80" w:type="dxa"/>
-              <w:right w:w="80" w:type="dxa"/>
-            </w:tcMar>
-          </w:tcPr>
-          <w:p>
-            <w:pPr>
-              <w:pStyle w:val="BodyText"/>
-            </w:pPr>
-            <w:r>
-              <w:t>Essential</w:t>
-            </w:r>
-          </w:p>
-        </w:tc>
-        <w:tc>
-          <w:tcPr>
-            <w:tcW w:w="3209" w:type="dxa"/>
-            <w:tcBorders>
-              <w:top w:val="single" w:sz="4" w:space="0" w:color="000000"/>
-              <w:left w:val="single" w:sz="4" w:space="0" w:color="000000"/>
-              <w:bottom w:val="single" w:sz="4" w:space="0" w:color="000000"/>
-              <w:right w:val="single" w:sz="4" w:space="0" w:color="000000"/>
-            </w:tcBorders>
-            <w:tcMar>
-              <w:top w:w="80" w:type="dxa"/>
-              <w:left w:w="80" w:type="dxa"/>
-              <w:bottom w:w="80" w:type="dxa"/>
-              <w:right w:w="80" w:type="dxa"/>
-            </w:tcMar>
-          </w:tcPr>
-          <w:p>
-            <w:pPr>
-              <w:spacing w:after="240"/>
-            </w:pPr>
+              <w:t>nput validation</w:t>
+            </w:r>
             <w:r>
               <w:rPr>
                 <w:rFonts w:eastAsia="Aptos" w:cs="Aptos"/>
@@ -2097,112 +1341,8 @@
                   <w14:bevel/>
                 </w14:textOutline>
               </w:rPr>
-              <w:t>Required to collect selected items prior to checkout.</w:t>
-            </w:r>
-          </w:p>
-        </w:tc>
-      </w:tr>
-      <w:tr>
-        <w:trPr>
-          <w:trHeight w:val="241"/>
-        </w:trPr>
-        <w:tc>
-          <w:tcPr>
-            <w:tcW w:w="1179" w:type="dxa"/>
-            <w:tcBorders>
-              <w:top w:val="single" w:sz="4" w:space="0" w:color="000000"/>
-              <w:left w:val="single" w:sz="4" w:space="0" w:color="000000"/>
-              <w:bottom w:val="single" w:sz="4" w:space="0" w:color="000000"/>
-              <w:right w:val="single" w:sz="4" w:space="0" w:color="000000"/>
-            </w:tcBorders>
-            <w:tcMar>
-              <w:top w:w="80" w:type="dxa"/>
-              <w:left w:w="80" w:type="dxa"/>
-              <w:bottom w:w="80" w:type="dxa"/>
-              <w:right w:w="80" w:type="dxa"/>
-            </w:tcMar>
-          </w:tcPr>
-          <w:p>
-            <w:pPr>
-              <w:pStyle w:val="BodyText"/>
-            </w:pPr>
-            <w:r>
-              <w:t>UC17</w:t>
-            </w:r>
-          </w:p>
-        </w:tc>
-        <w:tc>
-          <w:tcPr>
-            <w:tcW w:w="3161" w:type="dxa"/>
-            <w:tcBorders>
-              <w:top w:val="single" w:sz="4" w:space="0" w:color="000000"/>
-              <w:left w:val="single" w:sz="4" w:space="0" w:color="000000"/>
-              <w:bottom w:val="single" w:sz="4" w:space="0" w:color="000000"/>
-              <w:right w:val="single" w:sz="4" w:space="0" w:color="000000"/>
-            </w:tcBorders>
-            <w:tcMar>
-              <w:top w:w="80" w:type="dxa"/>
-              <w:left w:w="80" w:type="dxa"/>
-              <w:bottom w:w="80" w:type="dxa"/>
-              <w:right w:w="80" w:type="dxa"/>
-            </w:tcMar>
-          </w:tcPr>
-          <w:p>
-            <w:pPr>
-              <w:pStyle w:val="BodyText"/>
-            </w:pPr>
-            <w:proofErr w:type="spellStart"/>
-            <w:r>
-              <w:t>CustomerAuthentication</w:t>
-            </w:r>
-            <w:proofErr w:type="spellEnd"/>
-          </w:p>
-        </w:tc>
-        <w:tc>
-          <w:tcPr>
-            <w:tcW w:w="1467" w:type="dxa"/>
-            <w:tcBorders>
-              <w:top w:val="single" w:sz="4" w:space="0" w:color="000000"/>
-              <w:left w:val="single" w:sz="4" w:space="0" w:color="000000"/>
-              <w:bottom w:val="single" w:sz="4" w:space="0" w:color="000000"/>
-              <w:right w:val="single" w:sz="4" w:space="0" w:color="000000"/>
-            </w:tcBorders>
-            <w:tcMar>
-              <w:top w:w="80" w:type="dxa"/>
-              <w:left w:w="80" w:type="dxa"/>
-              <w:bottom w:w="80" w:type="dxa"/>
-              <w:right w:w="80" w:type="dxa"/>
-            </w:tcMar>
-          </w:tcPr>
-          <w:p>
-            <w:pPr>
-              <w:pStyle w:val="BodyText"/>
-            </w:pPr>
-            <w:r>
-              <w:t>Important</w:t>
-            </w:r>
-          </w:p>
-        </w:tc>
-        <w:tc>
-          <w:tcPr>
-            <w:tcW w:w="3209" w:type="dxa"/>
-            <w:tcBorders>
-              <w:top w:val="single" w:sz="4" w:space="0" w:color="000000"/>
-              <w:left w:val="single" w:sz="4" w:space="0" w:color="000000"/>
-              <w:bottom w:val="single" w:sz="4" w:space="0" w:color="000000"/>
-              <w:right w:val="single" w:sz="4" w:space="0" w:color="000000"/>
-            </w:tcBorders>
-            <w:tcMar>
-              <w:top w:w="80" w:type="dxa"/>
-              <w:left w:w="80" w:type="dxa"/>
-              <w:bottom w:w="80" w:type="dxa"/>
-              <w:right w:w="80" w:type="dxa"/>
-            </w:tcMar>
-          </w:tcPr>
-          <w:p>
-            <w:pPr>
-              <w:spacing w:after="240"/>
-            </w:pPr>
+              <w:t xml:space="preserve">, </w:t>
+            </w:r>
             <w:r>
               <w:rPr>
                 <w:rFonts w:eastAsia="Aptos" w:cs="Aptos"/>
@@ -2216,110 +1356,8 @@
                   <w14:bevel/>
                 </w14:textOutline>
               </w:rPr>
-              <w:t>Ensures secure access to protected account features.</w:t>
-            </w:r>
-          </w:p>
-        </w:tc>
-      </w:tr>
-      <w:tr>
-        <w:trPr>
-          <w:trHeight w:val="241"/>
-        </w:trPr>
-        <w:tc>
-          <w:tcPr>
-            <w:tcW w:w="1179" w:type="dxa"/>
-            <w:tcBorders>
-              <w:top w:val="single" w:sz="4" w:space="0" w:color="000000"/>
-              <w:left w:val="single" w:sz="4" w:space="0" w:color="000000"/>
-              <w:bottom w:val="single" w:sz="4" w:space="0" w:color="000000"/>
-              <w:right w:val="single" w:sz="4" w:space="0" w:color="000000"/>
-            </w:tcBorders>
-            <w:tcMar>
-              <w:top w:w="80" w:type="dxa"/>
-              <w:left w:w="80" w:type="dxa"/>
-              <w:bottom w:w="80" w:type="dxa"/>
-              <w:right w:w="80" w:type="dxa"/>
-            </w:tcMar>
-          </w:tcPr>
-          <w:p>
-            <w:pPr>
-              <w:pStyle w:val="BodyText"/>
-            </w:pPr>
-            <w:r>
-              <w:t>UC18</w:t>
-            </w:r>
-          </w:p>
-        </w:tc>
-        <w:tc>
-          <w:tcPr>
-            <w:tcW w:w="3161" w:type="dxa"/>
-            <w:tcBorders>
-              <w:top w:val="single" w:sz="4" w:space="0" w:color="000000"/>
-              <w:left w:val="single" w:sz="4" w:space="0" w:color="000000"/>
-              <w:bottom w:val="single" w:sz="4" w:space="0" w:color="000000"/>
-              <w:right w:val="single" w:sz="4" w:space="0" w:color="000000"/>
-            </w:tcBorders>
-            <w:tcMar>
-              <w:top w:w="80" w:type="dxa"/>
-              <w:left w:w="80" w:type="dxa"/>
-              <w:bottom w:w="80" w:type="dxa"/>
-              <w:right w:w="80" w:type="dxa"/>
-            </w:tcMar>
-          </w:tcPr>
-          <w:p>
-            <w:pPr>
-              <w:pStyle w:val="BodyText"/>
-            </w:pPr>
-            <w:r>
-              <w:t>Payment</w:t>
-            </w:r>
-          </w:p>
-        </w:tc>
-        <w:tc>
-          <w:tcPr>
-            <w:tcW w:w="1467" w:type="dxa"/>
-            <w:tcBorders>
-              <w:top w:val="single" w:sz="4" w:space="0" w:color="000000"/>
-              <w:left w:val="single" w:sz="4" w:space="0" w:color="000000"/>
-              <w:bottom w:val="single" w:sz="4" w:space="0" w:color="000000"/>
-              <w:right w:val="single" w:sz="4" w:space="0" w:color="000000"/>
-            </w:tcBorders>
-            <w:tcMar>
-              <w:top w:w="80" w:type="dxa"/>
-              <w:left w:w="80" w:type="dxa"/>
-              <w:bottom w:w="80" w:type="dxa"/>
-              <w:right w:w="80" w:type="dxa"/>
-            </w:tcMar>
-          </w:tcPr>
-          <w:p>
-            <w:pPr>
-              <w:pStyle w:val="BodyText"/>
-            </w:pPr>
-            <w:r>
-              <w:t>Important</w:t>
-            </w:r>
-          </w:p>
-        </w:tc>
-        <w:tc>
-          <w:tcPr>
-            <w:tcW w:w="3209" w:type="dxa"/>
-            <w:tcBorders>
-              <w:top w:val="single" w:sz="4" w:space="0" w:color="000000"/>
-              <w:left w:val="single" w:sz="4" w:space="0" w:color="000000"/>
-              <w:bottom w:val="single" w:sz="4" w:space="0" w:color="000000"/>
-              <w:right w:val="single" w:sz="4" w:space="0" w:color="000000"/>
-            </w:tcBorders>
-            <w:tcMar>
-              <w:top w:w="80" w:type="dxa"/>
-              <w:left w:w="80" w:type="dxa"/>
-              <w:bottom w:w="80" w:type="dxa"/>
-              <w:right w:w="80" w:type="dxa"/>
-            </w:tcMar>
-          </w:tcPr>
-          <w:p>
-            <w:pPr>
-              <w:spacing w:after="240"/>
-            </w:pPr>
+              <w:t>data accuracy</w:t>
+            </w:r>
             <w:r>
               <w:rPr>
                 <w:rFonts w:eastAsia="Aptos" w:cs="Aptos"/>
@@ -2333,112 +1371,8 @@
                   <w14:bevel/>
                 </w14:textOutline>
               </w:rPr>
-              <w:t>Enables payment processing; essential for real-world deployment though checkout logic may exist separately.</w:t>
-            </w:r>
-          </w:p>
-        </w:tc>
-      </w:tr>
-      <w:tr>
-        <w:trPr>
-          <w:trHeight w:val="241"/>
-        </w:trPr>
-        <w:tc>
-          <w:tcPr>
-            <w:tcW w:w="1179" w:type="dxa"/>
-            <w:tcBorders>
-              <w:top w:val="single" w:sz="4" w:space="0" w:color="000000"/>
-              <w:left w:val="single" w:sz="4" w:space="0" w:color="000000"/>
-              <w:bottom w:val="single" w:sz="4" w:space="0" w:color="000000"/>
-              <w:right w:val="single" w:sz="4" w:space="0" w:color="000000"/>
-            </w:tcBorders>
-            <w:tcMar>
-              <w:top w:w="80" w:type="dxa"/>
-              <w:left w:w="80" w:type="dxa"/>
-              <w:bottom w:w="80" w:type="dxa"/>
-              <w:right w:w="80" w:type="dxa"/>
-            </w:tcMar>
-          </w:tcPr>
-          <w:p>
-            <w:pPr>
-              <w:pStyle w:val="BodyText"/>
-            </w:pPr>
-            <w:r>
-              <w:t>UC19</w:t>
-            </w:r>
-          </w:p>
-        </w:tc>
-        <w:tc>
-          <w:tcPr>
-            <w:tcW w:w="3161" w:type="dxa"/>
-            <w:tcBorders>
-              <w:top w:val="single" w:sz="4" w:space="0" w:color="000000"/>
-              <w:left w:val="single" w:sz="4" w:space="0" w:color="000000"/>
-              <w:bottom w:val="single" w:sz="4" w:space="0" w:color="000000"/>
-              <w:right w:val="single" w:sz="4" w:space="0" w:color="000000"/>
-            </w:tcBorders>
-            <w:tcMar>
-              <w:top w:w="80" w:type="dxa"/>
-              <w:left w:w="80" w:type="dxa"/>
-              <w:bottom w:w="80" w:type="dxa"/>
-              <w:right w:w="80" w:type="dxa"/>
-            </w:tcMar>
-          </w:tcPr>
-          <w:p>
-            <w:pPr>
-              <w:pStyle w:val="BodyText"/>
-            </w:pPr>
-            <w:proofErr w:type="spellStart"/>
-            <w:r>
-              <w:t>CalculateTax</w:t>
-            </w:r>
-            <w:proofErr w:type="spellEnd"/>
-          </w:p>
-        </w:tc>
-        <w:tc>
-          <w:tcPr>
-            <w:tcW w:w="1467" w:type="dxa"/>
-            <w:tcBorders>
-              <w:top w:val="single" w:sz="4" w:space="0" w:color="000000"/>
-              <w:left w:val="single" w:sz="4" w:space="0" w:color="000000"/>
-              <w:bottom w:val="single" w:sz="4" w:space="0" w:color="000000"/>
-              <w:right w:val="single" w:sz="4" w:space="0" w:color="000000"/>
-            </w:tcBorders>
-            <w:tcMar>
-              <w:top w:w="80" w:type="dxa"/>
-              <w:left w:w="80" w:type="dxa"/>
-              <w:bottom w:w="80" w:type="dxa"/>
-              <w:right w:w="80" w:type="dxa"/>
-            </w:tcMar>
-          </w:tcPr>
-          <w:p>
-            <w:pPr>
-              <w:pStyle w:val="BodyText"/>
-            </w:pPr>
-            <w:r>
-              <w:t>Good to have</w:t>
-            </w:r>
-          </w:p>
-        </w:tc>
-        <w:tc>
-          <w:tcPr>
-            <w:tcW w:w="3209" w:type="dxa"/>
-            <w:tcBorders>
-              <w:top w:val="single" w:sz="4" w:space="0" w:color="000000"/>
-              <w:left w:val="single" w:sz="4" w:space="0" w:color="000000"/>
-              <w:bottom w:val="single" w:sz="4" w:space="0" w:color="000000"/>
-              <w:right w:val="single" w:sz="4" w:space="0" w:color="000000"/>
-            </w:tcBorders>
-            <w:tcMar>
-              <w:top w:w="80" w:type="dxa"/>
-              <w:left w:w="80" w:type="dxa"/>
-              <w:bottom w:w="80" w:type="dxa"/>
-              <w:right w:w="80" w:type="dxa"/>
-            </w:tcMar>
-          </w:tcPr>
-          <w:p>
-            <w:pPr>
-              <w:spacing w:after="240"/>
-            </w:pPr>
+              <w:t xml:space="preserve"> </w:t>
+            </w:r>
             <w:r>
               <w:rPr>
                 <w:rFonts w:eastAsia="Aptos" w:cs="Aptos"/>
@@ -2452,7 +1386,7 @@
                   <w14:bevel/>
                 </w14:textOutline>
               </w:rPr>
-              <w:t>Needed for pricing accuracy but system purchasing logic can still function conceptually without it.</w:t>
+              <w:t>and maintains system integrity.</w:t>
             </w:r>
           </w:p>
         </w:tc>
@@ -2482,7 +1416,7 @@
               <w:pStyle w:val="BodyText"/>
             </w:pPr>
             <w:r>
-              <w:t>UC20</w:t>
+              <w:t>UC09</w:t>
             </w:r>
           </w:p>
         </w:tc>
@@ -2508,7 +1442,7 @@
             </w:pPr>
             <w:proofErr w:type="spellStart"/>
             <w:r>
-              <w:t>ViewCart</w:t>
+              <w:t>RegisterCommercialAccount</w:t>
             </w:r>
             <w:proofErr w:type="spellEnd"/>
           </w:p>
@@ -2534,7 +1468,7 @@
               <w:pStyle w:val="BodyText"/>
             </w:pPr>
             <w:r>
-              <w:t>Essential</w:t>
+              <w:t>Important</w:t>
             </w:r>
           </w:p>
         </w:tc>
@@ -2571,14 +1505,14 @@
                   <w14:bevel/>
                 </w14:textOutline>
               </w:rPr>
-              <w:t>Users must review selected items before proceeding to checkout.</w:t>
+              <w:t>Supports business customers, expanding system usage but not blocking core retail use.</w:t>
             </w:r>
           </w:p>
         </w:tc>
       </w:tr>
       <w:tr>
         <w:trPr>
-          <w:trHeight w:val="740"/>
+          <w:trHeight w:val="241"/>
         </w:trPr>
         <w:tc>
           <w:tcPr>
@@ -2601,7 +1535,7 @@
               <w:pStyle w:val="BodyText"/>
             </w:pPr>
             <w:r>
-              <w:t>UC21</w:t>
+              <w:t>UC10</w:t>
             </w:r>
           </w:p>
         </w:tc>
@@ -2627,7 +1561,7 @@
             </w:pPr>
             <w:proofErr w:type="spellStart"/>
             <w:r>
-              <w:t>UpdateCart</w:t>
+              <w:t>RegisterNonCommercialAccount</w:t>
             </w:r>
             <w:proofErr w:type="spellEnd"/>
           </w:p>
@@ -2653,7 +1587,7 @@
               <w:pStyle w:val="BodyText"/>
             </w:pPr>
             <w:r>
-              <w:t>Essential</w:t>
+              <w:t>Important</w:t>
             </w:r>
           </w:p>
         </w:tc>
@@ -2690,7 +1624,7 @@
                   <w14:bevel/>
                 </w14:textOutline>
               </w:rPr>
-              <w:t>Users must be able to modify quantities or remove items before checkout to ensure order accuracy.</w:t>
+              <w:t>Enables standard customer onboarding for account-based purchases.</w:t>
             </w:r>
           </w:p>
         </w:tc>
@@ -2720,7 +1654,8 @@
               <w:pStyle w:val="BodyText"/>
             </w:pPr>
             <w:r>
-              <w:t>UC22</w:t>
+              <w:lastRenderedPageBreak/>
+              <w:t>UC11</w:t>
             </w:r>
           </w:p>
         </w:tc>
@@ -2746,7 +1681,7 @@
             </w:pPr>
             <w:proofErr w:type="spellStart"/>
             <w:r>
-              <w:t>SearchCatalogue</w:t>
+              <w:t>ValidateDetails</w:t>
             </w:r>
             <w:proofErr w:type="spellEnd"/>
           </w:p>
@@ -2793,12 +1728,23 @@
             </w:tcMar>
           </w:tcPr>
           <w:p>
-            <w:r>
-              <w:rPr>
-                <w:sz w:val="22"/>
-                <w:szCs w:val="22"/>
-              </w:rPr>
-              <w:t>This functionality helps customers find products more easily. The system can still operate without it as customers are able to browse the catalogue.</w:t>
+            <w:pPr>
+              <w:spacing w:after="240"/>
+            </w:pPr>
+            <w:r>
+              <w:rPr>
+                <w:rFonts w:eastAsia="Aptos" w:cs="Aptos"/>
+                <w:color w:val="000000"/>
+                <w:sz w:val="22"/>
+                <w:szCs w:val="22"/>
+                <w:u w:color="000000"/>
+                <w14:textOutline w14:w="0" w14:cap="flat" w14:cmpd="sng" w14:algn="ctr">
+                  <w14:noFill/>
+                  <w14:prstDash w14:val="solid"/>
+                  <w14:bevel/>
+                </w14:textOutline>
+              </w:rPr>
+              <w:t>Ensures user-submitted data correctness, reducing operational errors.</w:t>
             </w:r>
           </w:p>
         </w:tc>
@@ -2828,7 +1774,7 @@
               <w:pStyle w:val="BodyText"/>
             </w:pPr>
             <w:r>
-              <w:t>UC23</w:t>
+              <w:t>UC12</w:t>
             </w:r>
           </w:p>
         </w:tc>
@@ -2854,7 +1800,7 @@
             </w:pPr>
             <w:proofErr w:type="spellStart"/>
             <w:r>
-              <w:t>CalculateTotal</w:t>
+              <w:t>SMTP_Notification</w:t>
             </w:r>
             <w:proofErr w:type="spellEnd"/>
           </w:p>
@@ -2880,7 +1826,7 @@
               <w:pStyle w:val="BodyText"/>
             </w:pPr>
             <w:r>
-              <w:t>Essential</w:t>
+              <w:t>Important</w:t>
             </w:r>
           </w:p>
         </w:tc>
@@ -2902,38 +1848,22 @@
           </w:tcPr>
           <w:p>
             <w:pPr>
-              <w:rPr>
-                <w:sz w:val="22"/>
-                <w:szCs w:val="22"/>
-              </w:rPr>
-            </w:pPr>
-            <w:r>
-              <w:rPr>
-                <w:sz w:val="22"/>
-                <w:szCs w:val="22"/>
-              </w:rPr>
-              <w:t xml:space="preserve">This is an essential part of the checkout process. Before the payment </w:t>
-            </w:r>
-            <w:r>
-              <w:rPr>
-                <w:sz w:val="22"/>
-                <w:szCs w:val="22"/>
-              </w:rPr>
-              <w:t>can be</w:t>
-            </w:r>
-            <w:r>
-              <w:rPr>
-                <w:sz w:val="22"/>
-                <w:szCs w:val="22"/>
-              </w:rPr>
-              <w:t xml:space="preserve"> </w:t>
-            </w:r>
-            <w:r>
-              <w:rPr>
-                <w:sz w:val="22"/>
-                <w:szCs w:val="22"/>
-              </w:rPr>
-              <w:t>completed, the system must calculate the total.</w:t>
+              <w:spacing w:after="240"/>
+            </w:pPr>
+            <w:r>
+              <w:rPr>
+                <w:rFonts w:eastAsia="Aptos" w:cs="Aptos"/>
+                <w:color w:val="000000"/>
+                <w:sz w:val="22"/>
+                <w:szCs w:val="22"/>
+                <w:u w:color="000000"/>
+                <w14:textOutline w14:w="0" w14:cap="flat" w14:cmpd="sng" w14:algn="ctr">
+                  <w14:noFill/>
+                  <w14:prstDash w14:val="solid"/>
+                  <w14:bevel/>
+                </w14:textOutline>
+              </w:rPr>
+              <w:t>Provides transaction confirmations and user communications improving reliability.</w:t>
             </w:r>
           </w:p>
         </w:tc>
@@ -2963,8 +1893,7 @@
               <w:pStyle w:val="BodyText"/>
             </w:pPr>
             <w:r>
-              <w:lastRenderedPageBreak/>
-              <w:t>UC24</w:t>
+              <w:t>UC13</w:t>
             </w:r>
           </w:p>
         </w:tc>
@@ -2990,7 +1919,7 @@
             </w:pPr>
             <w:proofErr w:type="spellStart"/>
             <w:r>
-              <w:t>MakePromotion</w:t>
+              <w:t>PromptPasswordChange</w:t>
             </w:r>
             <w:proofErr w:type="spellEnd"/>
           </w:p>
@@ -3016,7 +1945,7 @@
               <w:pStyle w:val="BodyText"/>
             </w:pPr>
             <w:r>
-              <w:t>Important</w:t>
+              <w:t>Good to have</w:t>
             </w:r>
           </w:p>
         </w:tc>
@@ -3038,17 +1967,52 @@
           </w:tcPr>
           <w:p>
             <w:pPr>
-              <w:rPr>
-                <w:sz w:val="22"/>
-                <w:szCs w:val="22"/>
-              </w:rPr>
-            </w:pPr>
-            <w:r>
-              <w:rPr>
-                <w:sz w:val="22"/>
-                <w:szCs w:val="22"/>
-              </w:rPr>
-              <w:t>This functionality is important because the system can operate without promotions. However, promotions increase business value.</w:t>
+              <w:spacing w:after="240"/>
+            </w:pPr>
+            <w:r>
+              <w:rPr>
+                <w:rFonts w:eastAsia="Aptos" w:cs="Aptos"/>
+                <w:color w:val="000000"/>
+                <w:sz w:val="22"/>
+                <w:szCs w:val="22"/>
+                <w:u w:color="000000"/>
+                <w14:textOutline w14:w="0" w14:cap="flat" w14:cmpd="sng" w14:algn="ctr">
+                  <w14:noFill/>
+                  <w14:prstDash w14:val="solid"/>
+                  <w14:bevel/>
+                </w14:textOutline>
+              </w:rPr>
+              <w:t xml:space="preserve">Enhances long-term </w:t>
+            </w:r>
+            <w:r>
+              <w:rPr>
+                <w:rFonts w:eastAsia="Aptos" w:cs="Aptos"/>
+                <w:color w:val="000000"/>
+                <w:sz w:val="22"/>
+                <w:szCs w:val="22"/>
+                <w:u w:color="000000"/>
+                <w14:textOutline w14:w="0" w14:cap="flat" w14:cmpd="sng" w14:algn="ctr">
+                  <w14:noFill/>
+                  <w14:prstDash w14:val="solid"/>
+                  <w14:bevel/>
+                </w14:textOutline>
+              </w:rPr>
+              <w:t xml:space="preserve">account </w:t>
+            </w:r>
+            <w:r>
+              <w:rPr>
+                <w:rFonts w:eastAsia="Aptos" w:cs="Aptos"/>
+                <w:color w:val="000000"/>
+                <w:sz w:val="22"/>
+                <w:szCs w:val="22"/>
+                <w:u w:color="000000"/>
+                <w14:textOutline w14:w="0" w14:cap="flat" w14:cmpd="sng" w14:algn="ctr">
+                  <w14:noFill/>
+                  <w14:prstDash w14:val="solid"/>
+                  <w14:bevel/>
+                </w14:textOutline>
+              </w:rPr>
+              <w:t>security but not required for core operations.</w:t>
             </w:r>
           </w:p>
         </w:tc>
@@ -3078,7 +2042,7 @@
               <w:pStyle w:val="BodyText"/>
             </w:pPr>
             <w:r>
-              <w:t>UC25</w:t>
+              <w:t>UC14</w:t>
             </w:r>
           </w:p>
         </w:tc>
@@ -3104,7 +2068,7 @@
             </w:pPr>
             <w:proofErr w:type="spellStart"/>
             <w:r>
-              <w:t>TimeoutPromotion</w:t>
+              <w:t>EditUserDetails</w:t>
             </w:r>
             <w:proofErr w:type="spellEnd"/>
           </w:p>
@@ -3151,54 +2115,23 @@
             </w:tcMar>
           </w:tcPr>
           <w:p>
-            <w:r>
-              <w:rPr>
-                <w:sz w:val="22"/>
-                <w:szCs w:val="22"/>
-              </w:rPr>
-              <w:t xml:space="preserve">Handles promotion expiry but </w:t>
-            </w:r>
-            <w:r>
-              <w:rPr>
-                <w:sz w:val="22"/>
-                <w:szCs w:val="22"/>
-              </w:rPr>
-              <w:t>A</w:t>
-            </w:r>
-            <w:r>
-              <w:rPr>
-                <w:sz w:val="22"/>
-                <w:szCs w:val="22"/>
-              </w:rPr>
-              <w:t>dmin</w:t>
-            </w:r>
-            <w:r>
-              <w:rPr>
-                <w:sz w:val="22"/>
-                <w:szCs w:val="22"/>
-              </w:rPr>
-              <w:t xml:space="preserve"> </w:t>
-            </w:r>
-            <w:r>
-              <w:rPr>
-                <w:sz w:val="22"/>
-                <w:szCs w:val="22"/>
-              </w:rPr>
-              <w:t>can manually manage promotions</w:t>
-            </w:r>
-            <w:r>
-              <w:rPr>
-                <w:sz w:val="22"/>
-                <w:szCs w:val="22"/>
-              </w:rPr>
-              <w:t xml:space="preserve"> so this just helps with efficiency</w:t>
-            </w:r>
-            <w:r>
-              <w:rPr>
-                <w:sz w:val="22"/>
-                <w:szCs w:val="22"/>
-              </w:rPr>
-              <w:t>.</w:t>
+            <w:pPr>
+              <w:spacing w:after="240"/>
+            </w:pPr>
+            <w:r>
+              <w:rPr>
+                <w:rFonts w:eastAsia="Aptos" w:cs="Aptos"/>
+                <w:color w:val="000000"/>
+                <w:sz w:val="22"/>
+                <w:szCs w:val="22"/>
+                <w:u w:color="000000"/>
+                <w14:textOutline w14:w="0" w14:cap="flat" w14:cmpd="sng" w14:algn="ctr">
+                  <w14:noFill/>
+                  <w14:prstDash w14:val="solid"/>
+                  <w14:bevel/>
+                </w14:textOutline>
+              </w:rPr>
+              <w:t>Improves usability by allowing profile updates but not critical for purchases.</w:t>
             </w:r>
           </w:p>
         </w:tc>
@@ -3228,7 +2161,7 @@
               <w:pStyle w:val="BodyText"/>
             </w:pPr>
             <w:r>
-              <w:t>UC26</w:t>
+              <w:t>UC15</w:t>
             </w:r>
           </w:p>
         </w:tc>
@@ -3254,7 +2187,7 @@
             </w:pPr>
             <w:proofErr w:type="spellStart"/>
             <w:r>
-              <w:t>GenerateReport</w:t>
+              <w:t>ChangePassword</w:t>
             </w:r>
             <w:proofErr w:type="spellEnd"/>
           </w:p>
@@ -3302,87 +2235,22 @@
           </w:tcPr>
           <w:p>
             <w:pPr>
-              <w:rPr>
-                <w:sz w:val="22"/>
-                <w:szCs w:val="22"/>
-              </w:rPr>
-            </w:pPr>
-            <w:r>
-              <w:rPr>
-                <w:sz w:val="22"/>
-                <w:szCs w:val="22"/>
-              </w:rPr>
-              <w:t xml:space="preserve">Reports can help </w:t>
-            </w:r>
-            <w:r>
-              <w:rPr>
-                <w:sz w:val="22"/>
-                <w:szCs w:val="22"/>
-              </w:rPr>
-              <w:t>A</w:t>
-            </w:r>
-            <w:r>
-              <w:rPr>
-                <w:sz w:val="22"/>
-                <w:szCs w:val="22"/>
-              </w:rPr>
-              <w:t>dmi</w:t>
-            </w:r>
-            <w:r>
-              <w:rPr>
-                <w:sz w:val="22"/>
-                <w:szCs w:val="22"/>
-              </w:rPr>
-              <w:t xml:space="preserve">n to </w:t>
-            </w:r>
-            <w:r>
-              <w:rPr>
-                <w:sz w:val="22"/>
-                <w:szCs w:val="22"/>
-              </w:rPr>
-              <w:t>review system activity</w:t>
-            </w:r>
-            <w:r>
-              <w:rPr>
-                <w:sz w:val="22"/>
-                <w:szCs w:val="22"/>
-              </w:rPr>
-              <w:t xml:space="preserve"> and performance</w:t>
-            </w:r>
-            <w:r>
-              <w:rPr>
-                <w:sz w:val="22"/>
-                <w:szCs w:val="22"/>
-              </w:rPr>
-              <w:t xml:space="preserve"> but not required</w:t>
-            </w:r>
-            <w:r>
-              <w:rPr>
-                <w:sz w:val="22"/>
-                <w:szCs w:val="22"/>
-              </w:rPr>
-              <w:t xml:space="preserve"> for the system </w:t>
-            </w:r>
-            <w:r>
-              <w:rPr>
-                <w:sz w:val="22"/>
-                <w:szCs w:val="22"/>
-              </w:rPr>
-              <w:t xml:space="preserve">to </w:t>
-            </w:r>
-            <w:r>
-              <w:rPr>
-                <w:sz w:val="22"/>
-                <w:szCs w:val="22"/>
-              </w:rPr>
-              <w:t>operate</w:t>
-            </w:r>
-            <w:r>
-              <w:rPr>
-                <w:sz w:val="22"/>
-                <w:szCs w:val="22"/>
-              </w:rPr>
-              <w:t>.</w:t>
+              <w:spacing w:after="240"/>
+            </w:pPr>
+            <w:r>
+              <w:rPr>
+                <w:rFonts w:eastAsia="Aptos" w:cs="Aptos"/>
+                <w:color w:val="000000"/>
+                <w:sz w:val="22"/>
+                <w:szCs w:val="22"/>
+                <w:u w:color="000000"/>
+                <w14:textOutline w14:w="0" w14:cap="flat" w14:cmpd="sng" w14:algn="ctr">
+                  <w14:noFill/>
+                  <w14:prstDash w14:val="solid"/>
+                  <w14:bevel/>
+                </w14:textOutline>
+              </w:rPr>
+              <w:t>Security enhancement allowing users to maintain account protection.</w:t>
             </w:r>
           </w:p>
         </w:tc>
@@ -3412,7 +2280,7 @@
               <w:pStyle w:val="BodyText"/>
             </w:pPr>
             <w:r>
-              <w:t>UC27</w:t>
+              <w:t>UC16</w:t>
             </w:r>
           </w:p>
         </w:tc>
@@ -3438,7 +2306,7 @@
             </w:pPr>
             <w:proofErr w:type="spellStart"/>
             <w:r>
-              <w:t>SearchPromotion</w:t>
+              <w:t>AddToCart</w:t>
             </w:r>
             <w:proofErr w:type="spellEnd"/>
           </w:p>
@@ -3464,7 +2332,7 @@
               <w:pStyle w:val="BodyText"/>
             </w:pPr>
             <w:r>
-              <w:t>Good to have</w:t>
+              <w:t>Essential</w:t>
             </w:r>
           </w:p>
         </w:tc>
@@ -3485,54 +2353,23 @@
             </w:tcMar>
           </w:tcPr>
           <w:p>
-            <w:r>
-              <w:rPr>
-                <w:sz w:val="22"/>
-                <w:szCs w:val="22"/>
-              </w:rPr>
-              <w:t xml:space="preserve">This is for </w:t>
-            </w:r>
-            <w:r>
-              <w:rPr>
-                <w:sz w:val="22"/>
-                <w:szCs w:val="22"/>
-              </w:rPr>
-              <w:t>A</w:t>
-            </w:r>
-            <w:r>
-              <w:rPr>
-                <w:sz w:val="22"/>
-                <w:szCs w:val="22"/>
-              </w:rPr>
-              <w:t>dmin</w:t>
-            </w:r>
-            <w:r>
-              <w:rPr>
-                <w:sz w:val="22"/>
-                <w:szCs w:val="22"/>
-              </w:rPr>
-              <w:t xml:space="preserve"> convenience</w:t>
-            </w:r>
-            <w:r>
-              <w:rPr>
-                <w:sz w:val="22"/>
-                <w:szCs w:val="22"/>
-              </w:rPr>
-              <w:t xml:space="preserve"> to help them find promotions easily</w:t>
-            </w:r>
-            <w:r>
-              <w:rPr>
-                <w:sz w:val="22"/>
-                <w:szCs w:val="22"/>
-              </w:rPr>
-              <w:t xml:space="preserve"> but is not essential </w:t>
-            </w:r>
-            <w:r>
-              <w:rPr>
-                <w:sz w:val="22"/>
-                <w:szCs w:val="22"/>
-              </w:rPr>
-              <w:t>for promotion to function.</w:t>
+            <w:pPr>
+              <w:spacing w:after="240"/>
+            </w:pPr>
+            <w:r>
+              <w:rPr>
+                <w:rFonts w:eastAsia="Aptos" w:cs="Aptos"/>
+                <w:color w:val="000000"/>
+                <w:sz w:val="22"/>
+                <w:szCs w:val="22"/>
+                <w:u w:color="000000"/>
+                <w14:textOutline w14:w="0" w14:cap="flat" w14:cmpd="sng" w14:algn="ctr">
+                  <w14:noFill/>
+                  <w14:prstDash w14:val="solid"/>
+                  <w14:bevel/>
+                </w14:textOutline>
+              </w:rPr>
+              <w:t>This is essential as it allows users to collect selected items before proceeding to checkout.</w:t>
             </w:r>
           </w:p>
         </w:tc>
@@ -3562,7 +2399,7 @@
               <w:pStyle w:val="BodyText"/>
             </w:pPr>
             <w:r>
-              <w:t>UC28</w:t>
+              <w:t>UC17</w:t>
             </w:r>
           </w:p>
         </w:tc>
@@ -3586,12 +2423,9 @@
             <w:pPr>
               <w:pStyle w:val="BodyText"/>
             </w:pPr>
-            <w:r>
-              <w:t>Access/</w:t>
-            </w:r>
             <w:proofErr w:type="spellStart"/>
             <w:r>
-              <w:t>UpdatePromotionData</w:t>
+              <w:t>CustomerAuthentication</w:t>
             </w:r>
             <w:proofErr w:type="spellEnd"/>
           </w:p>
@@ -3639,70 +2473,37 @@
           </w:tcPr>
           <w:p>
             <w:pPr>
-              <w:rPr>
-                <w:sz w:val="22"/>
-                <w:szCs w:val="22"/>
-                <w:lang w:val="en-GB"/>
-              </w:rPr>
-            </w:pPr>
-            <w:r>
-              <w:rPr>
-                <w:sz w:val="22"/>
-                <w:szCs w:val="22"/>
-              </w:rPr>
-              <w:t>This is</w:t>
-            </w:r>
-            <w:r>
-              <w:rPr>
-                <w:sz w:val="22"/>
-                <w:szCs w:val="22"/>
-              </w:rPr>
-              <w:t xml:space="preserve"> an</w:t>
-            </w:r>
-            <w:r>
-              <w:rPr>
-                <w:sz w:val="22"/>
-                <w:szCs w:val="22"/>
-              </w:rPr>
-              <w:t xml:space="preserve"> important feature to ensure promotion data is accurat</w:t>
-            </w:r>
-            <w:r>
-              <w:rPr>
-                <w:sz w:val="22"/>
-                <w:szCs w:val="22"/>
-              </w:rPr>
-              <w:t>ely maintained</w:t>
-            </w:r>
-            <w:r>
-              <w:rPr>
-                <w:sz w:val="22"/>
-                <w:szCs w:val="22"/>
-              </w:rPr>
-              <w:t xml:space="preserve">. </w:t>
-            </w:r>
-            <w:r>
-              <w:rPr>
-                <w:sz w:val="22"/>
-                <w:szCs w:val="22"/>
-                <w:lang w:val="en-GB"/>
-              </w:rPr>
-              <w:t xml:space="preserve">It is important for correct promotion behaviour, but the system can still operate without </w:t>
-            </w:r>
-            <w:r>
-              <w:rPr>
-                <w:sz w:val="22"/>
-                <w:szCs w:val="22"/>
-                <w:lang w:val="en-GB"/>
-              </w:rPr>
-              <w:t xml:space="preserve">constant </w:t>
-            </w:r>
-            <w:r>
-              <w:rPr>
-                <w:sz w:val="22"/>
-                <w:szCs w:val="22"/>
-                <w:lang w:val="en-GB"/>
-              </w:rPr>
-              <w:t>updates.</w:t>
+              <w:spacing w:after="240"/>
+            </w:pPr>
+            <w:r>
+              <w:rPr>
+                <w:rFonts w:eastAsia="Aptos" w:cs="Aptos"/>
+                <w:color w:val="000000"/>
+                <w:sz w:val="22"/>
+                <w:szCs w:val="22"/>
+                <w:u w:color="000000"/>
+                <w14:textOutline w14:w="0" w14:cap="flat" w14:cmpd="sng" w14:algn="ctr">
+                  <w14:noFill/>
+                  <w14:prstDash w14:val="solid"/>
+                  <w14:bevel/>
+                </w14:textOutline>
+              </w:rPr>
+              <w:t>This is important for system security. It e</w:t>
+            </w:r>
+            <w:r>
+              <w:rPr>
+                <w:rFonts w:eastAsia="Aptos" w:cs="Aptos"/>
+                <w:color w:val="000000"/>
+                <w:sz w:val="22"/>
+                <w:szCs w:val="22"/>
+                <w:u w:color="000000"/>
+                <w14:textOutline w14:w="0" w14:cap="flat" w14:cmpd="sng" w14:algn="ctr">
+                  <w14:noFill/>
+                  <w14:prstDash w14:val="solid"/>
+                  <w14:bevel/>
+                </w14:textOutline>
+              </w:rPr>
+              <w:t>nsures secure access to protected account features.</w:t>
             </w:r>
           </w:p>
         </w:tc>
@@ -3732,7 +2533,7 @@
               <w:pStyle w:val="BodyText"/>
             </w:pPr>
             <w:r>
-              <w:t>UC29</w:t>
+              <w:t>UC18</w:t>
             </w:r>
           </w:p>
         </w:tc>
@@ -3756,11 +2557,9 @@
             <w:pPr>
               <w:pStyle w:val="BodyText"/>
             </w:pPr>
-            <w:proofErr w:type="spellStart"/>
-            <w:r>
-              <w:t>RecordSale</w:t>
-            </w:r>
-            <w:proofErr w:type="spellEnd"/>
+            <w:r>
+              <w:t>Payment</w:t>
+            </w:r>
           </w:p>
         </w:tc>
         <w:tc>
@@ -3784,7 +2583,7 @@
               <w:pStyle w:val="BodyText"/>
             </w:pPr>
             <w:r>
-              <w:t>Essential</w:t>
+              <w:t>Important</w:t>
             </w:r>
           </w:p>
         </w:tc>
@@ -3806,17 +2605,22 @@
           </w:tcPr>
           <w:p>
             <w:pPr>
-              <w:rPr>
-                <w:sz w:val="22"/>
-                <w:szCs w:val="22"/>
-              </w:rPr>
-            </w:pPr>
-            <w:r>
-              <w:rPr>
-                <w:sz w:val="22"/>
-                <w:szCs w:val="22"/>
-              </w:rPr>
-              <w:t>This is essential to maintain accurate company records and accurate stock tracking.</w:t>
+              <w:spacing w:after="240"/>
+            </w:pPr>
+            <w:r>
+              <w:rPr>
+                <w:rFonts w:eastAsia="Aptos" w:cs="Aptos"/>
+                <w:color w:val="000000"/>
+                <w:sz w:val="22"/>
+                <w:szCs w:val="22"/>
+                <w:u w:color="000000"/>
+                <w14:textOutline w14:w="0" w14:cap="flat" w14:cmpd="sng" w14:algn="ctr">
+                  <w14:noFill/>
+                  <w14:prstDash w14:val="solid"/>
+                  <w14:bevel/>
+                </w14:textOutline>
+              </w:rPr>
+              <w:t>Enables payment processing; essential for real-world deployment though checkout logic may exist separately.</w:t>
             </w:r>
           </w:p>
         </w:tc>
@@ -3846,7 +2650,7 @@
               <w:pStyle w:val="BodyText"/>
             </w:pPr>
             <w:r>
-              <w:t>UC30</w:t>
+              <w:t>UC19</w:t>
             </w:r>
           </w:p>
         </w:tc>
@@ -3872,7 +2676,7 @@
             </w:pPr>
             <w:proofErr w:type="spellStart"/>
             <w:r>
-              <w:t>RecordClick</w:t>
+              <w:t>CalculateTax</w:t>
             </w:r>
             <w:proofErr w:type="spellEnd"/>
           </w:p>
@@ -3920,31 +2724,22 @@
           </w:tcPr>
           <w:p>
             <w:pPr>
-              <w:rPr>
-                <w:sz w:val="22"/>
-                <w:szCs w:val="22"/>
-              </w:rPr>
-            </w:pPr>
-            <w:r>
-              <w:rPr>
-                <w:sz w:val="22"/>
-                <w:szCs w:val="22"/>
-              </w:rPr>
-              <w:t xml:space="preserve">Not essential for basic system functionality but </w:t>
-            </w:r>
-            <w:r>
-              <w:rPr>
-                <w:sz w:val="22"/>
-                <w:szCs w:val="22"/>
-              </w:rPr>
-              <w:t>records user interactions for analytic</w:t>
-            </w:r>
-            <w:r>
-              <w:rPr>
-                <w:sz w:val="22"/>
-                <w:szCs w:val="22"/>
-              </w:rPr>
-              <w:t>s.</w:t>
+              <w:spacing w:after="240"/>
+            </w:pPr>
+            <w:r>
+              <w:rPr>
+                <w:rFonts w:eastAsia="Aptos" w:cs="Aptos"/>
+                <w:color w:val="000000"/>
+                <w:sz w:val="22"/>
+                <w:szCs w:val="22"/>
+                <w:u w:color="000000"/>
+                <w14:textOutline w14:w="0" w14:cap="flat" w14:cmpd="sng" w14:algn="ctr">
+                  <w14:noFill/>
+                  <w14:prstDash w14:val="solid"/>
+                  <w14:bevel/>
+                </w14:textOutline>
+              </w:rPr>
+              <w:t>Needed for pricing accuracy but system purchasing logic can still function conceptually without it.</w:t>
             </w:r>
           </w:p>
         </w:tc>
@@ -3974,7 +2769,7 @@
               <w:pStyle w:val="BodyText"/>
             </w:pPr>
             <w:r>
-              <w:t>UC31</w:t>
+              <w:t>UC20</w:t>
             </w:r>
           </w:p>
         </w:tc>
@@ -4000,7 +2795,7 @@
             </w:pPr>
             <w:proofErr w:type="spellStart"/>
             <w:r>
-              <w:t>QueryPromotion</w:t>
+              <w:t>ViewCart</w:t>
             </w:r>
             <w:proofErr w:type="spellEnd"/>
           </w:p>
@@ -4026,7 +2821,7 @@
               <w:pStyle w:val="BodyText"/>
             </w:pPr>
             <w:r>
-              <w:t>Important</w:t>
+              <w:t>Essential</w:t>
             </w:r>
           </w:p>
         </w:tc>
@@ -4048,17 +2843,171 @@
           </w:tcPr>
           <w:p>
             <w:pPr>
-              <w:rPr>
-                <w:sz w:val="22"/>
-                <w:szCs w:val="22"/>
-              </w:rPr>
-            </w:pPr>
-            <w:r>
-              <w:rPr>
-                <w:sz w:val="22"/>
-                <w:szCs w:val="22"/>
-              </w:rPr>
-              <w:t>This functionality ensures correct promotion eligibility during purchases.</w:t>
+              <w:spacing w:after="240"/>
+            </w:pPr>
+            <w:r>
+              <w:rPr>
+                <w:rFonts w:eastAsia="Aptos" w:cs="Aptos"/>
+                <w:color w:val="000000"/>
+                <w:sz w:val="22"/>
+                <w:szCs w:val="22"/>
+                <w:u w:color="000000"/>
+                <w14:textOutline w14:w="0" w14:cap="flat" w14:cmpd="sng" w14:algn="ctr">
+                  <w14:noFill/>
+                  <w14:prstDash w14:val="solid"/>
+                  <w14:bevel/>
+                </w14:textOutline>
+              </w:rPr>
+              <w:t>Users must review selected items before proceeding to checkout.</w:t>
+            </w:r>
+            <w:r>
+              <w:rPr>
+                <w:rFonts w:eastAsia="Aptos" w:cs="Aptos"/>
+                <w:color w:val="000000"/>
+                <w:sz w:val="22"/>
+                <w:szCs w:val="22"/>
+                <w:u w:color="000000"/>
+                <w14:textOutline w14:w="0" w14:cap="flat" w14:cmpd="sng" w14:algn="ctr">
+                  <w14:noFill/>
+                  <w14:prstDash w14:val="solid"/>
+                  <w14:bevel/>
+                </w14:textOutline>
+              </w:rPr>
+              <w:t xml:space="preserve"> This is essential for verifying orders before checkout.</w:t>
+            </w:r>
+          </w:p>
+        </w:tc>
+      </w:tr>
+      <w:tr>
+        <w:trPr>
+          <w:trHeight w:val="740"/>
+        </w:trPr>
+        <w:tc>
+          <w:tcPr>
+            <w:tcW w:w="1179" w:type="dxa"/>
+            <w:tcBorders>
+              <w:top w:val="single" w:sz="4" w:space="0" w:color="000000"/>
+              <w:left w:val="single" w:sz="4" w:space="0" w:color="000000"/>
+              <w:bottom w:val="single" w:sz="4" w:space="0" w:color="000000"/>
+              <w:right w:val="single" w:sz="4" w:space="0" w:color="000000"/>
+            </w:tcBorders>
+            <w:tcMar>
+              <w:top w:w="80" w:type="dxa"/>
+              <w:left w:w="80" w:type="dxa"/>
+              <w:bottom w:w="80" w:type="dxa"/>
+              <w:right w:w="80" w:type="dxa"/>
+            </w:tcMar>
+          </w:tcPr>
+          <w:p>
+            <w:pPr>
+              <w:pStyle w:val="BodyText"/>
+            </w:pPr>
+            <w:r>
+              <w:t>UC21</w:t>
+            </w:r>
+          </w:p>
+        </w:tc>
+        <w:tc>
+          <w:tcPr>
+            <w:tcW w:w="3161" w:type="dxa"/>
+            <w:tcBorders>
+              <w:top w:val="single" w:sz="4" w:space="0" w:color="000000"/>
+              <w:left w:val="single" w:sz="4" w:space="0" w:color="000000"/>
+              <w:bottom w:val="single" w:sz="4" w:space="0" w:color="000000"/>
+              <w:right w:val="single" w:sz="4" w:space="0" w:color="000000"/>
+            </w:tcBorders>
+            <w:tcMar>
+              <w:top w:w="80" w:type="dxa"/>
+              <w:left w:w="80" w:type="dxa"/>
+              <w:bottom w:w="80" w:type="dxa"/>
+              <w:right w:w="80" w:type="dxa"/>
+            </w:tcMar>
+          </w:tcPr>
+          <w:p>
+            <w:pPr>
+              <w:pStyle w:val="BodyText"/>
+            </w:pPr>
+            <w:proofErr w:type="spellStart"/>
+            <w:r>
+              <w:t>UpdateCart</w:t>
+            </w:r>
+            <w:proofErr w:type="spellEnd"/>
+          </w:p>
+        </w:tc>
+        <w:tc>
+          <w:tcPr>
+            <w:tcW w:w="1467" w:type="dxa"/>
+            <w:tcBorders>
+              <w:top w:val="single" w:sz="4" w:space="0" w:color="000000"/>
+              <w:left w:val="single" w:sz="4" w:space="0" w:color="000000"/>
+              <w:bottom w:val="single" w:sz="4" w:space="0" w:color="000000"/>
+              <w:right w:val="single" w:sz="4" w:space="0" w:color="000000"/>
+            </w:tcBorders>
+            <w:tcMar>
+              <w:top w:w="80" w:type="dxa"/>
+              <w:left w:w="80" w:type="dxa"/>
+              <w:bottom w:w="80" w:type="dxa"/>
+              <w:right w:w="80" w:type="dxa"/>
+            </w:tcMar>
+          </w:tcPr>
+          <w:p>
+            <w:pPr>
+              <w:pStyle w:val="BodyText"/>
+            </w:pPr>
+            <w:r>
+              <w:t>Essential</w:t>
+            </w:r>
+          </w:p>
+        </w:tc>
+        <w:tc>
+          <w:tcPr>
+            <w:tcW w:w="3209" w:type="dxa"/>
+            <w:tcBorders>
+              <w:top w:val="single" w:sz="4" w:space="0" w:color="000000"/>
+              <w:left w:val="single" w:sz="4" w:space="0" w:color="000000"/>
+              <w:bottom w:val="single" w:sz="4" w:space="0" w:color="000000"/>
+              <w:right w:val="single" w:sz="4" w:space="0" w:color="000000"/>
+            </w:tcBorders>
+            <w:tcMar>
+              <w:top w:w="80" w:type="dxa"/>
+              <w:left w:w="80" w:type="dxa"/>
+              <w:bottom w:w="80" w:type="dxa"/>
+              <w:right w:w="80" w:type="dxa"/>
+            </w:tcMar>
+          </w:tcPr>
+          <w:p>
+            <w:pPr>
+              <w:spacing w:after="240"/>
+            </w:pPr>
+            <w:r>
+              <w:rPr>
+                <w:rFonts w:eastAsia="Aptos" w:cs="Aptos"/>
+                <w:color w:val="000000"/>
+                <w:sz w:val="22"/>
+                <w:szCs w:val="22"/>
+                <w:u w:color="000000"/>
+                <w14:textOutline w14:w="0" w14:cap="flat" w14:cmpd="sng" w14:algn="ctr">
+                  <w14:noFill/>
+                  <w14:prstDash w14:val="solid"/>
+                  <w14:bevel/>
+                </w14:textOutline>
+              </w:rPr>
+              <w:t>Allows u</w:t>
+            </w:r>
+            <w:r>
+              <w:rPr>
+                <w:rFonts w:eastAsia="Aptos" w:cs="Aptos"/>
+                <w:color w:val="000000"/>
+                <w:sz w:val="22"/>
+                <w:szCs w:val="22"/>
+                <w:u w:color="000000"/>
+                <w14:textOutline w14:w="0" w14:cap="flat" w14:cmpd="sng" w14:algn="ctr">
+                  <w14:noFill/>
+                  <w14:prstDash w14:val="solid"/>
+                  <w14:bevel/>
+                </w14:textOutline>
+              </w:rPr>
+              <w:t>sers to modify quantities or remove items before checkout to ensure order accuracy.</w:t>
             </w:r>
           </w:p>
         </w:tc>
@@ -4088,7 +3037,8 @@
               <w:pStyle w:val="BodyText"/>
             </w:pPr>
             <w:r>
-              <w:t>UC32</w:t>
+              <w:lastRenderedPageBreak/>
+              <w:t>UC22</w:t>
             </w:r>
           </w:p>
         </w:tc>
@@ -4114,7 +3064,7 @@
             </w:pPr>
             <w:proofErr w:type="spellStart"/>
             <w:r>
-              <w:t>RecordTransaction</w:t>
+              <w:t>SearchCatalogue</w:t>
             </w:r>
             <w:proofErr w:type="spellEnd"/>
           </w:p>
@@ -4140,7 +3090,7 @@
               <w:pStyle w:val="BodyText"/>
             </w:pPr>
             <w:r>
-              <w:t>Essential</w:t>
+              <w:t>Important</w:t>
             </w:r>
           </w:p>
         </w:tc>
@@ -4161,46 +3111,12 @@
             </w:tcMar>
           </w:tcPr>
           <w:p>
-            <w:pPr>
-              <w:rPr>
-                <w:sz w:val="22"/>
-                <w:szCs w:val="22"/>
-              </w:rPr>
-            </w:pPr>
-            <w:r>
-              <w:rPr>
-                <w:sz w:val="22"/>
-                <w:szCs w:val="22"/>
-              </w:rPr>
-              <w:t>This functionality</w:t>
-            </w:r>
-            <w:r>
-              <w:rPr>
-                <w:sz w:val="22"/>
-                <w:szCs w:val="22"/>
-              </w:rPr>
-              <w:t xml:space="preserve"> is essential as it </w:t>
-            </w:r>
-            <w:r>
-              <w:rPr>
-                <w:sz w:val="22"/>
-                <w:szCs w:val="22"/>
-              </w:rPr>
-              <w:t xml:space="preserve">records completed transactions and </w:t>
-            </w:r>
-            <w:r>
-              <w:rPr>
-                <w:sz w:val="22"/>
-                <w:szCs w:val="22"/>
-              </w:rPr>
-              <w:t>ensures</w:t>
-            </w:r>
-            <w:r>
-              <w:rPr>
-                <w:sz w:val="22"/>
-                <w:szCs w:val="22"/>
-              </w:rPr>
-              <w:t xml:space="preserve"> payments are properly tracked. </w:t>
+            <w:r>
+              <w:rPr>
+                <w:sz w:val="22"/>
+                <w:szCs w:val="22"/>
+              </w:rPr>
+              <w:t>This functionality helps customers find products more easily. The system can still operate without it as customers are able to browse the catalogue.</w:t>
             </w:r>
           </w:p>
         </w:tc>
@@ -4230,7 +3146,7 @@
               <w:pStyle w:val="BodyText"/>
             </w:pPr>
             <w:r>
-              <w:t>UC33</w:t>
+              <w:t>UC23</w:t>
             </w:r>
           </w:p>
         </w:tc>
@@ -4256,7 +3172,7 @@
             </w:pPr>
             <w:proofErr w:type="spellStart"/>
             <w:r>
-              <w:t>RequestPromotion</w:t>
+              <w:t>CalculateTotal</w:t>
             </w:r>
             <w:proofErr w:type="spellEnd"/>
           </w:p>
@@ -4282,7 +3198,7 @@
               <w:pStyle w:val="BodyText"/>
             </w:pPr>
             <w:r>
-              <w:t>Important</w:t>
+              <w:t>Essential</w:t>
             </w:r>
           </w:p>
         </w:tc>
@@ -4314,7 +3230,28 @@
                 <w:sz w:val="22"/>
                 <w:szCs w:val="22"/>
               </w:rPr>
-              <w:t>This functionality supports the promotion workflow by allowing promotions to be requested and managed.</w:t>
+              <w:t xml:space="preserve">This is an essential part of the checkout process. Before the payment </w:t>
+            </w:r>
+            <w:r>
+              <w:rPr>
+                <w:sz w:val="22"/>
+                <w:szCs w:val="22"/>
+              </w:rPr>
+              <w:t>can be</w:t>
+            </w:r>
+            <w:r>
+              <w:rPr>
+                <w:sz w:val="22"/>
+                <w:szCs w:val="22"/>
+              </w:rPr>
+              <w:t xml:space="preserve"> </w:t>
+            </w:r>
+            <w:r>
+              <w:rPr>
+                <w:sz w:val="22"/>
+                <w:szCs w:val="22"/>
+              </w:rPr>
+              <w:t>completed, the system must calculate the total.</w:t>
             </w:r>
           </w:p>
         </w:tc>
@@ -4344,7 +3281,7 @@
               <w:pStyle w:val="BodyText"/>
             </w:pPr>
             <w:r>
-              <w:t>UC34</w:t>
+              <w:t>UC24</w:t>
             </w:r>
           </w:p>
         </w:tc>
@@ -4368,12 +3305,9 @@
             <w:pPr>
               <w:pStyle w:val="BodyText"/>
             </w:pPr>
-            <w:r>
-              <w:t>Access/</w:t>
-            </w:r>
             <w:proofErr w:type="spellStart"/>
             <w:r>
-              <w:t>UpdateSalesData</w:t>
+              <w:t>MakePromotion</w:t>
             </w:r>
             <w:proofErr w:type="spellEnd"/>
           </w:p>
@@ -4428,19 +3362,10 @@
             </w:pPr>
             <w:r>
               <w:rPr>
-                <w:color w:val="000000"/>
-                <w:sz w:val="22"/>
-                <w:szCs w:val="22"/>
-              </w:rPr>
-              <w:t>This functionality allows sales data to be maintained accurately for business tracking. It is important for monitoring sales performance</w:t>
-            </w:r>
-            <w:r>
-              <w:rPr>
-                <w:color w:val="000000"/>
-                <w:sz w:val="22"/>
-                <w:szCs w:val="22"/>
-              </w:rPr>
-              <w:t>.</w:t>
+                <w:sz w:val="22"/>
+                <w:szCs w:val="22"/>
+              </w:rPr>
+              <w:t>This functionality is important because the system can operate without promotions. However, promotions increase business value.</w:t>
             </w:r>
           </w:p>
         </w:tc>
@@ -4470,8 +3395,7 @@
               <w:pStyle w:val="BodyText"/>
             </w:pPr>
             <w:r>
-              <w:lastRenderedPageBreak/>
-              <w:t>UC35</w:t>
+              <w:t>UC25</w:t>
             </w:r>
           </w:p>
         </w:tc>
@@ -4497,7 +3421,7 @@
             </w:pPr>
             <w:proofErr w:type="spellStart"/>
             <w:r>
-              <w:t>GeneratePromotionReport</w:t>
+              <w:t>TimeoutPromotion</w:t>
             </w:r>
             <w:proofErr w:type="spellEnd"/>
           </w:p>
@@ -4544,18 +3468,47 @@
             </w:tcMar>
           </w:tcPr>
           <w:p>
-            <w:pPr>
-              <w:rPr>
-                <w:sz w:val="22"/>
-                <w:szCs w:val="22"/>
-              </w:rPr>
-            </w:pPr>
-            <w:r>
-              <w:rPr>
-                <w:sz w:val="22"/>
-                <w:szCs w:val="22"/>
-              </w:rPr>
-              <w:t>This functionality generates reports that are useful for promotion analysis</w:t>
+            <w:r>
+              <w:rPr>
+                <w:sz w:val="22"/>
+                <w:szCs w:val="22"/>
+              </w:rPr>
+              <w:t xml:space="preserve">Handles promotion expiry but </w:t>
+            </w:r>
+            <w:r>
+              <w:rPr>
+                <w:sz w:val="22"/>
+                <w:szCs w:val="22"/>
+              </w:rPr>
+              <w:t>A</w:t>
+            </w:r>
+            <w:r>
+              <w:rPr>
+                <w:sz w:val="22"/>
+                <w:szCs w:val="22"/>
+              </w:rPr>
+              <w:t>dmin</w:t>
+            </w:r>
+            <w:r>
+              <w:rPr>
+                <w:sz w:val="22"/>
+                <w:szCs w:val="22"/>
+              </w:rPr>
+              <w:t xml:space="preserve"> </w:t>
+            </w:r>
+            <w:r>
+              <w:rPr>
+                <w:sz w:val="22"/>
+                <w:szCs w:val="22"/>
+              </w:rPr>
+              <w:t>can manually manage promotions</w:t>
+            </w:r>
+            <w:r>
+              <w:rPr>
+                <w:sz w:val="22"/>
+                <w:szCs w:val="22"/>
+              </w:rPr>
+              <w:t xml:space="preserve"> so this just helps with efficiency</w:t>
             </w:r>
             <w:r>
               <w:rPr>
@@ -4592,7 +3545,7 @@
               <w:pStyle w:val="BodyText"/>
             </w:pPr>
             <w:r>
-              <w:t>UC36</w:t>
+              <w:t>UC26</w:t>
             </w:r>
           </w:p>
         </w:tc>
@@ -4618,7 +3571,7 @@
             </w:pPr>
             <w:proofErr w:type="spellStart"/>
             <w:r>
-              <w:t>GenerateClickReport</w:t>
+              <w:t>GenerateReport</w:t>
             </w:r>
             <w:proofErr w:type="spellEnd"/>
           </w:p>
@@ -4676,39 +3629,77 @@
                 <w:sz w:val="22"/>
                 <w:szCs w:val="22"/>
               </w:rPr>
-              <w:t xml:space="preserve">This functionality generates reports based on user interactions. It is useful for </w:t>
-            </w:r>
-            <w:proofErr w:type="spellStart"/>
-            <w:r>
-              <w:rPr>
-                <w:sz w:val="22"/>
-                <w:szCs w:val="22"/>
-              </w:rPr>
-              <w:t>analysing</w:t>
-            </w:r>
-            <w:proofErr w:type="spellEnd"/>
-            <w:r>
-              <w:rPr>
-                <w:sz w:val="22"/>
-                <w:szCs w:val="22"/>
-              </w:rPr>
-              <w:t xml:space="preserve"> user </w:t>
-            </w:r>
-            <w:proofErr w:type="spellStart"/>
-            <w:r>
-              <w:rPr>
-                <w:sz w:val="22"/>
-                <w:szCs w:val="22"/>
-              </w:rPr>
-              <w:t>behaviour</w:t>
-            </w:r>
-            <w:proofErr w:type="spellEnd"/>
-            <w:r>
-              <w:rPr>
-                <w:sz w:val="22"/>
-                <w:szCs w:val="22"/>
-              </w:rPr>
-              <w:t>, but it is not required for system functionality.</w:t>
+              <w:t xml:space="preserve">Reports can help </w:t>
+            </w:r>
+            <w:r>
+              <w:rPr>
+                <w:sz w:val="22"/>
+                <w:szCs w:val="22"/>
+              </w:rPr>
+              <w:t>A</w:t>
+            </w:r>
+            <w:r>
+              <w:rPr>
+                <w:sz w:val="22"/>
+                <w:szCs w:val="22"/>
+              </w:rPr>
+              <w:t>dmi</w:t>
+            </w:r>
+            <w:r>
+              <w:rPr>
+                <w:sz w:val="22"/>
+                <w:szCs w:val="22"/>
+              </w:rPr>
+              <w:t xml:space="preserve">n to </w:t>
+            </w:r>
+            <w:r>
+              <w:rPr>
+                <w:sz w:val="22"/>
+                <w:szCs w:val="22"/>
+              </w:rPr>
+              <w:t>review system activity</w:t>
+            </w:r>
+            <w:r>
+              <w:rPr>
+                <w:sz w:val="22"/>
+                <w:szCs w:val="22"/>
+              </w:rPr>
+              <w:t xml:space="preserve"> and performance</w:t>
+            </w:r>
+            <w:r>
+              <w:rPr>
+                <w:sz w:val="22"/>
+                <w:szCs w:val="22"/>
+              </w:rPr>
+              <w:t xml:space="preserve"> but not required</w:t>
+            </w:r>
+            <w:r>
+              <w:rPr>
+                <w:sz w:val="22"/>
+                <w:szCs w:val="22"/>
+              </w:rPr>
+              <w:t xml:space="preserve"> for the system </w:t>
+            </w:r>
+            <w:r>
+              <w:rPr>
+                <w:sz w:val="22"/>
+                <w:szCs w:val="22"/>
+              </w:rPr>
+              <w:t xml:space="preserve">to </w:t>
+            </w:r>
+            <w:r>
+              <w:rPr>
+                <w:sz w:val="22"/>
+                <w:szCs w:val="22"/>
+              </w:rPr>
+              <w:t>operate</w:t>
+            </w:r>
+            <w:r>
+              <w:rPr>
+                <w:sz w:val="22"/>
+                <w:szCs w:val="22"/>
+              </w:rPr>
+              <w:t>.</w:t>
             </w:r>
           </w:p>
         </w:tc>
@@ -4738,6 +3729,1340 @@
               <w:pStyle w:val="BodyText"/>
             </w:pPr>
             <w:r>
+              <w:t>UC27</w:t>
+            </w:r>
+          </w:p>
+        </w:tc>
+        <w:tc>
+          <w:tcPr>
+            <w:tcW w:w="3161" w:type="dxa"/>
+            <w:tcBorders>
+              <w:top w:val="single" w:sz="4" w:space="0" w:color="000000"/>
+              <w:left w:val="single" w:sz="4" w:space="0" w:color="000000"/>
+              <w:bottom w:val="single" w:sz="4" w:space="0" w:color="000000"/>
+              <w:right w:val="single" w:sz="4" w:space="0" w:color="000000"/>
+            </w:tcBorders>
+            <w:tcMar>
+              <w:top w:w="80" w:type="dxa"/>
+              <w:left w:w="80" w:type="dxa"/>
+              <w:bottom w:w="80" w:type="dxa"/>
+              <w:right w:w="80" w:type="dxa"/>
+            </w:tcMar>
+          </w:tcPr>
+          <w:p>
+            <w:pPr>
+              <w:pStyle w:val="BodyText"/>
+            </w:pPr>
+            <w:proofErr w:type="spellStart"/>
+            <w:r>
+              <w:t>SearchPromotion</w:t>
+            </w:r>
+            <w:proofErr w:type="spellEnd"/>
+          </w:p>
+        </w:tc>
+        <w:tc>
+          <w:tcPr>
+            <w:tcW w:w="1467" w:type="dxa"/>
+            <w:tcBorders>
+              <w:top w:val="single" w:sz="4" w:space="0" w:color="000000"/>
+              <w:left w:val="single" w:sz="4" w:space="0" w:color="000000"/>
+              <w:bottom w:val="single" w:sz="4" w:space="0" w:color="000000"/>
+              <w:right w:val="single" w:sz="4" w:space="0" w:color="000000"/>
+            </w:tcBorders>
+            <w:tcMar>
+              <w:top w:w="80" w:type="dxa"/>
+              <w:left w:w="80" w:type="dxa"/>
+              <w:bottom w:w="80" w:type="dxa"/>
+              <w:right w:w="80" w:type="dxa"/>
+            </w:tcMar>
+          </w:tcPr>
+          <w:p>
+            <w:pPr>
+              <w:pStyle w:val="BodyText"/>
+            </w:pPr>
+            <w:r>
+              <w:t>Good to have</w:t>
+            </w:r>
+          </w:p>
+        </w:tc>
+        <w:tc>
+          <w:tcPr>
+            <w:tcW w:w="3209" w:type="dxa"/>
+            <w:tcBorders>
+              <w:top w:val="single" w:sz="4" w:space="0" w:color="000000"/>
+              <w:left w:val="single" w:sz="4" w:space="0" w:color="000000"/>
+              <w:bottom w:val="single" w:sz="4" w:space="0" w:color="000000"/>
+              <w:right w:val="single" w:sz="4" w:space="0" w:color="000000"/>
+            </w:tcBorders>
+            <w:tcMar>
+              <w:top w:w="80" w:type="dxa"/>
+              <w:left w:w="80" w:type="dxa"/>
+              <w:bottom w:w="80" w:type="dxa"/>
+              <w:right w:w="80" w:type="dxa"/>
+            </w:tcMar>
+          </w:tcPr>
+          <w:p>
+            <w:r>
+              <w:rPr>
+                <w:sz w:val="22"/>
+                <w:szCs w:val="22"/>
+              </w:rPr>
+              <w:t xml:space="preserve">This is for </w:t>
+            </w:r>
+            <w:r>
+              <w:rPr>
+                <w:sz w:val="22"/>
+                <w:szCs w:val="22"/>
+              </w:rPr>
+              <w:t>A</w:t>
+            </w:r>
+            <w:r>
+              <w:rPr>
+                <w:sz w:val="22"/>
+                <w:szCs w:val="22"/>
+              </w:rPr>
+              <w:t>dmin</w:t>
+            </w:r>
+            <w:r>
+              <w:rPr>
+                <w:sz w:val="22"/>
+                <w:szCs w:val="22"/>
+              </w:rPr>
+              <w:t xml:space="preserve"> convenience</w:t>
+            </w:r>
+            <w:r>
+              <w:rPr>
+                <w:sz w:val="22"/>
+                <w:szCs w:val="22"/>
+              </w:rPr>
+              <w:t xml:space="preserve"> to help them find promotions easily</w:t>
+            </w:r>
+            <w:r>
+              <w:rPr>
+                <w:sz w:val="22"/>
+                <w:szCs w:val="22"/>
+              </w:rPr>
+              <w:t xml:space="preserve"> but is not essential </w:t>
+            </w:r>
+            <w:r>
+              <w:rPr>
+                <w:sz w:val="22"/>
+                <w:szCs w:val="22"/>
+              </w:rPr>
+              <w:t>for promotion to function.</w:t>
+            </w:r>
+          </w:p>
+        </w:tc>
+      </w:tr>
+      <w:tr>
+        <w:trPr>
+          <w:trHeight w:val="241"/>
+        </w:trPr>
+        <w:tc>
+          <w:tcPr>
+            <w:tcW w:w="1179" w:type="dxa"/>
+            <w:tcBorders>
+              <w:top w:val="single" w:sz="4" w:space="0" w:color="000000"/>
+              <w:left w:val="single" w:sz="4" w:space="0" w:color="000000"/>
+              <w:bottom w:val="single" w:sz="4" w:space="0" w:color="000000"/>
+              <w:right w:val="single" w:sz="4" w:space="0" w:color="000000"/>
+            </w:tcBorders>
+            <w:tcMar>
+              <w:top w:w="80" w:type="dxa"/>
+              <w:left w:w="80" w:type="dxa"/>
+              <w:bottom w:w="80" w:type="dxa"/>
+              <w:right w:w="80" w:type="dxa"/>
+            </w:tcMar>
+          </w:tcPr>
+          <w:p>
+            <w:pPr>
+              <w:pStyle w:val="BodyText"/>
+            </w:pPr>
+            <w:r>
+              <w:t>UC28</w:t>
+            </w:r>
+          </w:p>
+        </w:tc>
+        <w:tc>
+          <w:tcPr>
+            <w:tcW w:w="3161" w:type="dxa"/>
+            <w:tcBorders>
+              <w:top w:val="single" w:sz="4" w:space="0" w:color="000000"/>
+              <w:left w:val="single" w:sz="4" w:space="0" w:color="000000"/>
+              <w:bottom w:val="single" w:sz="4" w:space="0" w:color="000000"/>
+              <w:right w:val="single" w:sz="4" w:space="0" w:color="000000"/>
+            </w:tcBorders>
+            <w:tcMar>
+              <w:top w:w="80" w:type="dxa"/>
+              <w:left w:w="80" w:type="dxa"/>
+              <w:bottom w:w="80" w:type="dxa"/>
+              <w:right w:w="80" w:type="dxa"/>
+            </w:tcMar>
+          </w:tcPr>
+          <w:p>
+            <w:pPr>
+              <w:pStyle w:val="BodyText"/>
+            </w:pPr>
+            <w:r>
+              <w:t>Access/</w:t>
+            </w:r>
+            <w:proofErr w:type="spellStart"/>
+            <w:r>
+              <w:t>UpdatePromotionData</w:t>
+            </w:r>
+            <w:proofErr w:type="spellEnd"/>
+          </w:p>
+        </w:tc>
+        <w:tc>
+          <w:tcPr>
+            <w:tcW w:w="1467" w:type="dxa"/>
+            <w:tcBorders>
+              <w:top w:val="single" w:sz="4" w:space="0" w:color="000000"/>
+              <w:left w:val="single" w:sz="4" w:space="0" w:color="000000"/>
+              <w:bottom w:val="single" w:sz="4" w:space="0" w:color="000000"/>
+              <w:right w:val="single" w:sz="4" w:space="0" w:color="000000"/>
+            </w:tcBorders>
+            <w:tcMar>
+              <w:top w:w="80" w:type="dxa"/>
+              <w:left w:w="80" w:type="dxa"/>
+              <w:bottom w:w="80" w:type="dxa"/>
+              <w:right w:w="80" w:type="dxa"/>
+            </w:tcMar>
+          </w:tcPr>
+          <w:p>
+            <w:pPr>
+              <w:pStyle w:val="BodyText"/>
+            </w:pPr>
+            <w:r>
+              <w:t>Important</w:t>
+            </w:r>
+          </w:p>
+        </w:tc>
+        <w:tc>
+          <w:tcPr>
+            <w:tcW w:w="3209" w:type="dxa"/>
+            <w:tcBorders>
+              <w:top w:val="single" w:sz="4" w:space="0" w:color="000000"/>
+              <w:left w:val="single" w:sz="4" w:space="0" w:color="000000"/>
+              <w:bottom w:val="single" w:sz="4" w:space="0" w:color="000000"/>
+              <w:right w:val="single" w:sz="4" w:space="0" w:color="000000"/>
+            </w:tcBorders>
+            <w:tcMar>
+              <w:top w:w="80" w:type="dxa"/>
+              <w:left w:w="80" w:type="dxa"/>
+              <w:bottom w:w="80" w:type="dxa"/>
+              <w:right w:w="80" w:type="dxa"/>
+            </w:tcMar>
+          </w:tcPr>
+          <w:p>
+            <w:pPr>
+              <w:rPr>
+                <w:sz w:val="22"/>
+                <w:szCs w:val="22"/>
+                <w:lang w:val="en-GB"/>
+              </w:rPr>
+            </w:pPr>
+            <w:r>
+              <w:rPr>
+                <w:sz w:val="22"/>
+                <w:szCs w:val="22"/>
+              </w:rPr>
+              <w:t>This is</w:t>
+            </w:r>
+            <w:r>
+              <w:rPr>
+                <w:sz w:val="22"/>
+                <w:szCs w:val="22"/>
+              </w:rPr>
+              <w:t xml:space="preserve"> an</w:t>
+            </w:r>
+            <w:r>
+              <w:rPr>
+                <w:sz w:val="22"/>
+                <w:szCs w:val="22"/>
+              </w:rPr>
+              <w:t xml:space="preserve"> important feature to ensure promotion data is accurat</w:t>
+            </w:r>
+            <w:r>
+              <w:rPr>
+                <w:sz w:val="22"/>
+                <w:szCs w:val="22"/>
+              </w:rPr>
+              <w:t>ely maintained</w:t>
+            </w:r>
+            <w:r>
+              <w:rPr>
+                <w:sz w:val="22"/>
+                <w:szCs w:val="22"/>
+              </w:rPr>
+              <w:t xml:space="preserve">. </w:t>
+            </w:r>
+            <w:r>
+              <w:rPr>
+                <w:sz w:val="22"/>
+                <w:szCs w:val="22"/>
+                <w:lang w:val="en-GB"/>
+              </w:rPr>
+              <w:t xml:space="preserve">It is important for correct promotion behaviour, but the system can still operate without </w:t>
+            </w:r>
+            <w:r>
+              <w:rPr>
+                <w:sz w:val="22"/>
+                <w:szCs w:val="22"/>
+                <w:lang w:val="en-GB"/>
+              </w:rPr>
+              <w:t xml:space="preserve">constant </w:t>
+            </w:r>
+            <w:r>
+              <w:rPr>
+                <w:sz w:val="22"/>
+                <w:szCs w:val="22"/>
+                <w:lang w:val="en-GB"/>
+              </w:rPr>
+              <w:t>updates.</w:t>
+            </w:r>
+          </w:p>
+        </w:tc>
+      </w:tr>
+      <w:tr>
+        <w:trPr>
+          <w:trHeight w:val="241"/>
+        </w:trPr>
+        <w:tc>
+          <w:tcPr>
+            <w:tcW w:w="1179" w:type="dxa"/>
+            <w:tcBorders>
+              <w:top w:val="single" w:sz="4" w:space="0" w:color="000000"/>
+              <w:left w:val="single" w:sz="4" w:space="0" w:color="000000"/>
+              <w:bottom w:val="single" w:sz="4" w:space="0" w:color="000000"/>
+              <w:right w:val="single" w:sz="4" w:space="0" w:color="000000"/>
+            </w:tcBorders>
+            <w:tcMar>
+              <w:top w:w="80" w:type="dxa"/>
+              <w:left w:w="80" w:type="dxa"/>
+              <w:bottom w:w="80" w:type="dxa"/>
+              <w:right w:w="80" w:type="dxa"/>
+            </w:tcMar>
+          </w:tcPr>
+          <w:p>
+            <w:pPr>
+              <w:pStyle w:val="BodyText"/>
+            </w:pPr>
+            <w:r>
+              <w:t>UC29</w:t>
+            </w:r>
+          </w:p>
+        </w:tc>
+        <w:tc>
+          <w:tcPr>
+            <w:tcW w:w="3161" w:type="dxa"/>
+            <w:tcBorders>
+              <w:top w:val="single" w:sz="4" w:space="0" w:color="000000"/>
+              <w:left w:val="single" w:sz="4" w:space="0" w:color="000000"/>
+              <w:bottom w:val="single" w:sz="4" w:space="0" w:color="000000"/>
+              <w:right w:val="single" w:sz="4" w:space="0" w:color="000000"/>
+            </w:tcBorders>
+            <w:tcMar>
+              <w:top w:w="80" w:type="dxa"/>
+              <w:left w:w="80" w:type="dxa"/>
+              <w:bottom w:w="80" w:type="dxa"/>
+              <w:right w:w="80" w:type="dxa"/>
+            </w:tcMar>
+          </w:tcPr>
+          <w:p>
+            <w:pPr>
+              <w:pStyle w:val="BodyText"/>
+            </w:pPr>
+            <w:proofErr w:type="spellStart"/>
+            <w:r>
+              <w:t>RecordSale</w:t>
+            </w:r>
+            <w:proofErr w:type="spellEnd"/>
+          </w:p>
+        </w:tc>
+        <w:tc>
+          <w:tcPr>
+            <w:tcW w:w="1467" w:type="dxa"/>
+            <w:tcBorders>
+              <w:top w:val="single" w:sz="4" w:space="0" w:color="000000"/>
+              <w:left w:val="single" w:sz="4" w:space="0" w:color="000000"/>
+              <w:bottom w:val="single" w:sz="4" w:space="0" w:color="000000"/>
+              <w:right w:val="single" w:sz="4" w:space="0" w:color="000000"/>
+            </w:tcBorders>
+            <w:tcMar>
+              <w:top w:w="80" w:type="dxa"/>
+              <w:left w:w="80" w:type="dxa"/>
+              <w:bottom w:w="80" w:type="dxa"/>
+              <w:right w:w="80" w:type="dxa"/>
+            </w:tcMar>
+          </w:tcPr>
+          <w:p>
+            <w:pPr>
+              <w:pStyle w:val="BodyText"/>
+            </w:pPr>
+            <w:r>
+              <w:t>Essential</w:t>
+            </w:r>
+          </w:p>
+        </w:tc>
+        <w:tc>
+          <w:tcPr>
+            <w:tcW w:w="3209" w:type="dxa"/>
+            <w:tcBorders>
+              <w:top w:val="single" w:sz="4" w:space="0" w:color="000000"/>
+              <w:left w:val="single" w:sz="4" w:space="0" w:color="000000"/>
+              <w:bottom w:val="single" w:sz="4" w:space="0" w:color="000000"/>
+              <w:right w:val="single" w:sz="4" w:space="0" w:color="000000"/>
+            </w:tcBorders>
+            <w:tcMar>
+              <w:top w:w="80" w:type="dxa"/>
+              <w:left w:w="80" w:type="dxa"/>
+              <w:bottom w:w="80" w:type="dxa"/>
+              <w:right w:w="80" w:type="dxa"/>
+            </w:tcMar>
+          </w:tcPr>
+          <w:p>
+            <w:pPr>
+              <w:rPr>
+                <w:sz w:val="22"/>
+                <w:szCs w:val="22"/>
+              </w:rPr>
+            </w:pPr>
+            <w:r>
+              <w:rPr>
+                <w:sz w:val="22"/>
+                <w:szCs w:val="22"/>
+              </w:rPr>
+              <w:t>This is essential to maintain accurate company records and accurate stock tracking.</w:t>
+            </w:r>
+          </w:p>
+        </w:tc>
+      </w:tr>
+      <w:tr>
+        <w:trPr>
+          <w:trHeight w:val="241"/>
+        </w:trPr>
+        <w:tc>
+          <w:tcPr>
+            <w:tcW w:w="1179" w:type="dxa"/>
+            <w:tcBorders>
+              <w:top w:val="single" w:sz="4" w:space="0" w:color="000000"/>
+              <w:left w:val="single" w:sz="4" w:space="0" w:color="000000"/>
+              <w:bottom w:val="single" w:sz="4" w:space="0" w:color="000000"/>
+              <w:right w:val="single" w:sz="4" w:space="0" w:color="000000"/>
+            </w:tcBorders>
+            <w:tcMar>
+              <w:top w:w="80" w:type="dxa"/>
+              <w:left w:w="80" w:type="dxa"/>
+              <w:bottom w:w="80" w:type="dxa"/>
+              <w:right w:w="80" w:type="dxa"/>
+            </w:tcMar>
+          </w:tcPr>
+          <w:p>
+            <w:pPr>
+              <w:pStyle w:val="BodyText"/>
+            </w:pPr>
+            <w:r>
+              <w:t>UC30</w:t>
+            </w:r>
+          </w:p>
+        </w:tc>
+        <w:tc>
+          <w:tcPr>
+            <w:tcW w:w="3161" w:type="dxa"/>
+            <w:tcBorders>
+              <w:top w:val="single" w:sz="4" w:space="0" w:color="000000"/>
+              <w:left w:val="single" w:sz="4" w:space="0" w:color="000000"/>
+              <w:bottom w:val="single" w:sz="4" w:space="0" w:color="000000"/>
+              <w:right w:val="single" w:sz="4" w:space="0" w:color="000000"/>
+            </w:tcBorders>
+            <w:tcMar>
+              <w:top w:w="80" w:type="dxa"/>
+              <w:left w:w="80" w:type="dxa"/>
+              <w:bottom w:w="80" w:type="dxa"/>
+              <w:right w:w="80" w:type="dxa"/>
+            </w:tcMar>
+          </w:tcPr>
+          <w:p>
+            <w:pPr>
+              <w:pStyle w:val="BodyText"/>
+            </w:pPr>
+            <w:proofErr w:type="spellStart"/>
+            <w:r>
+              <w:t>RecordClick</w:t>
+            </w:r>
+            <w:proofErr w:type="spellEnd"/>
+          </w:p>
+        </w:tc>
+        <w:tc>
+          <w:tcPr>
+            <w:tcW w:w="1467" w:type="dxa"/>
+            <w:tcBorders>
+              <w:top w:val="single" w:sz="4" w:space="0" w:color="000000"/>
+              <w:left w:val="single" w:sz="4" w:space="0" w:color="000000"/>
+              <w:bottom w:val="single" w:sz="4" w:space="0" w:color="000000"/>
+              <w:right w:val="single" w:sz="4" w:space="0" w:color="000000"/>
+            </w:tcBorders>
+            <w:tcMar>
+              <w:top w:w="80" w:type="dxa"/>
+              <w:left w:w="80" w:type="dxa"/>
+              <w:bottom w:w="80" w:type="dxa"/>
+              <w:right w:w="80" w:type="dxa"/>
+            </w:tcMar>
+          </w:tcPr>
+          <w:p>
+            <w:pPr>
+              <w:pStyle w:val="BodyText"/>
+            </w:pPr>
+            <w:r>
+              <w:t>Good to have</w:t>
+            </w:r>
+          </w:p>
+        </w:tc>
+        <w:tc>
+          <w:tcPr>
+            <w:tcW w:w="3209" w:type="dxa"/>
+            <w:tcBorders>
+              <w:top w:val="single" w:sz="4" w:space="0" w:color="000000"/>
+              <w:left w:val="single" w:sz="4" w:space="0" w:color="000000"/>
+              <w:bottom w:val="single" w:sz="4" w:space="0" w:color="000000"/>
+              <w:right w:val="single" w:sz="4" w:space="0" w:color="000000"/>
+            </w:tcBorders>
+            <w:tcMar>
+              <w:top w:w="80" w:type="dxa"/>
+              <w:left w:w="80" w:type="dxa"/>
+              <w:bottom w:w="80" w:type="dxa"/>
+              <w:right w:w="80" w:type="dxa"/>
+            </w:tcMar>
+          </w:tcPr>
+          <w:p>
+            <w:pPr>
+              <w:rPr>
+                <w:sz w:val="22"/>
+                <w:szCs w:val="22"/>
+              </w:rPr>
+            </w:pPr>
+            <w:r>
+              <w:rPr>
+                <w:sz w:val="22"/>
+                <w:szCs w:val="22"/>
+              </w:rPr>
+              <w:t xml:space="preserve">Not essential for basic system functionality but </w:t>
+            </w:r>
+            <w:r>
+              <w:rPr>
+                <w:sz w:val="22"/>
+                <w:szCs w:val="22"/>
+              </w:rPr>
+              <w:t>records user interactions for analytic</w:t>
+            </w:r>
+            <w:r>
+              <w:rPr>
+                <w:sz w:val="22"/>
+                <w:szCs w:val="22"/>
+              </w:rPr>
+              <w:t>s.</w:t>
+            </w:r>
+          </w:p>
+        </w:tc>
+      </w:tr>
+      <w:tr>
+        <w:trPr>
+          <w:trHeight w:val="241"/>
+        </w:trPr>
+        <w:tc>
+          <w:tcPr>
+            <w:tcW w:w="1179" w:type="dxa"/>
+            <w:tcBorders>
+              <w:top w:val="single" w:sz="4" w:space="0" w:color="000000"/>
+              <w:left w:val="single" w:sz="4" w:space="0" w:color="000000"/>
+              <w:bottom w:val="single" w:sz="4" w:space="0" w:color="000000"/>
+              <w:right w:val="single" w:sz="4" w:space="0" w:color="000000"/>
+            </w:tcBorders>
+            <w:tcMar>
+              <w:top w:w="80" w:type="dxa"/>
+              <w:left w:w="80" w:type="dxa"/>
+              <w:bottom w:w="80" w:type="dxa"/>
+              <w:right w:w="80" w:type="dxa"/>
+            </w:tcMar>
+          </w:tcPr>
+          <w:p>
+            <w:pPr>
+              <w:pStyle w:val="BodyText"/>
+            </w:pPr>
+            <w:r>
+              <w:t>UC31</w:t>
+            </w:r>
+          </w:p>
+        </w:tc>
+        <w:tc>
+          <w:tcPr>
+            <w:tcW w:w="3161" w:type="dxa"/>
+            <w:tcBorders>
+              <w:top w:val="single" w:sz="4" w:space="0" w:color="000000"/>
+              <w:left w:val="single" w:sz="4" w:space="0" w:color="000000"/>
+              <w:bottom w:val="single" w:sz="4" w:space="0" w:color="000000"/>
+              <w:right w:val="single" w:sz="4" w:space="0" w:color="000000"/>
+            </w:tcBorders>
+            <w:tcMar>
+              <w:top w:w="80" w:type="dxa"/>
+              <w:left w:w="80" w:type="dxa"/>
+              <w:bottom w:w="80" w:type="dxa"/>
+              <w:right w:w="80" w:type="dxa"/>
+            </w:tcMar>
+          </w:tcPr>
+          <w:p>
+            <w:pPr>
+              <w:pStyle w:val="BodyText"/>
+            </w:pPr>
+            <w:proofErr w:type="spellStart"/>
+            <w:r>
+              <w:t>QueryPromotion</w:t>
+            </w:r>
+            <w:proofErr w:type="spellEnd"/>
+          </w:p>
+        </w:tc>
+        <w:tc>
+          <w:tcPr>
+            <w:tcW w:w="1467" w:type="dxa"/>
+            <w:tcBorders>
+              <w:top w:val="single" w:sz="4" w:space="0" w:color="000000"/>
+              <w:left w:val="single" w:sz="4" w:space="0" w:color="000000"/>
+              <w:bottom w:val="single" w:sz="4" w:space="0" w:color="000000"/>
+              <w:right w:val="single" w:sz="4" w:space="0" w:color="000000"/>
+            </w:tcBorders>
+            <w:tcMar>
+              <w:top w:w="80" w:type="dxa"/>
+              <w:left w:w="80" w:type="dxa"/>
+              <w:bottom w:w="80" w:type="dxa"/>
+              <w:right w:w="80" w:type="dxa"/>
+            </w:tcMar>
+          </w:tcPr>
+          <w:p>
+            <w:pPr>
+              <w:pStyle w:val="BodyText"/>
+            </w:pPr>
+            <w:r>
+              <w:t>Important</w:t>
+            </w:r>
+          </w:p>
+        </w:tc>
+        <w:tc>
+          <w:tcPr>
+            <w:tcW w:w="3209" w:type="dxa"/>
+            <w:tcBorders>
+              <w:top w:val="single" w:sz="4" w:space="0" w:color="000000"/>
+              <w:left w:val="single" w:sz="4" w:space="0" w:color="000000"/>
+              <w:bottom w:val="single" w:sz="4" w:space="0" w:color="000000"/>
+              <w:right w:val="single" w:sz="4" w:space="0" w:color="000000"/>
+            </w:tcBorders>
+            <w:tcMar>
+              <w:top w:w="80" w:type="dxa"/>
+              <w:left w:w="80" w:type="dxa"/>
+              <w:bottom w:w="80" w:type="dxa"/>
+              <w:right w:w="80" w:type="dxa"/>
+            </w:tcMar>
+          </w:tcPr>
+          <w:p>
+            <w:pPr>
+              <w:rPr>
+                <w:sz w:val="22"/>
+                <w:szCs w:val="22"/>
+              </w:rPr>
+            </w:pPr>
+            <w:r>
+              <w:rPr>
+                <w:sz w:val="22"/>
+                <w:szCs w:val="22"/>
+              </w:rPr>
+              <w:t>This functionality ensures correct promotion eligibility during purchases.</w:t>
+            </w:r>
+          </w:p>
+        </w:tc>
+      </w:tr>
+      <w:tr>
+        <w:trPr>
+          <w:trHeight w:val="241"/>
+        </w:trPr>
+        <w:tc>
+          <w:tcPr>
+            <w:tcW w:w="1179" w:type="dxa"/>
+            <w:tcBorders>
+              <w:top w:val="single" w:sz="4" w:space="0" w:color="000000"/>
+              <w:left w:val="single" w:sz="4" w:space="0" w:color="000000"/>
+              <w:bottom w:val="single" w:sz="4" w:space="0" w:color="000000"/>
+              <w:right w:val="single" w:sz="4" w:space="0" w:color="000000"/>
+            </w:tcBorders>
+            <w:tcMar>
+              <w:top w:w="80" w:type="dxa"/>
+              <w:left w:w="80" w:type="dxa"/>
+              <w:bottom w:w="80" w:type="dxa"/>
+              <w:right w:w="80" w:type="dxa"/>
+            </w:tcMar>
+          </w:tcPr>
+          <w:p>
+            <w:pPr>
+              <w:pStyle w:val="BodyText"/>
+            </w:pPr>
+            <w:r>
+              <w:t>UC32</w:t>
+            </w:r>
+          </w:p>
+        </w:tc>
+        <w:tc>
+          <w:tcPr>
+            <w:tcW w:w="3161" w:type="dxa"/>
+            <w:tcBorders>
+              <w:top w:val="single" w:sz="4" w:space="0" w:color="000000"/>
+              <w:left w:val="single" w:sz="4" w:space="0" w:color="000000"/>
+              <w:bottom w:val="single" w:sz="4" w:space="0" w:color="000000"/>
+              <w:right w:val="single" w:sz="4" w:space="0" w:color="000000"/>
+            </w:tcBorders>
+            <w:tcMar>
+              <w:top w:w="80" w:type="dxa"/>
+              <w:left w:w="80" w:type="dxa"/>
+              <w:bottom w:w="80" w:type="dxa"/>
+              <w:right w:w="80" w:type="dxa"/>
+            </w:tcMar>
+          </w:tcPr>
+          <w:p>
+            <w:pPr>
+              <w:pStyle w:val="BodyText"/>
+            </w:pPr>
+            <w:proofErr w:type="spellStart"/>
+            <w:r>
+              <w:t>RecordTransaction</w:t>
+            </w:r>
+            <w:proofErr w:type="spellEnd"/>
+          </w:p>
+        </w:tc>
+        <w:tc>
+          <w:tcPr>
+            <w:tcW w:w="1467" w:type="dxa"/>
+            <w:tcBorders>
+              <w:top w:val="single" w:sz="4" w:space="0" w:color="000000"/>
+              <w:left w:val="single" w:sz="4" w:space="0" w:color="000000"/>
+              <w:bottom w:val="single" w:sz="4" w:space="0" w:color="000000"/>
+              <w:right w:val="single" w:sz="4" w:space="0" w:color="000000"/>
+            </w:tcBorders>
+            <w:tcMar>
+              <w:top w:w="80" w:type="dxa"/>
+              <w:left w:w="80" w:type="dxa"/>
+              <w:bottom w:w="80" w:type="dxa"/>
+              <w:right w:w="80" w:type="dxa"/>
+            </w:tcMar>
+          </w:tcPr>
+          <w:p>
+            <w:pPr>
+              <w:pStyle w:val="BodyText"/>
+            </w:pPr>
+            <w:r>
+              <w:t>Essential</w:t>
+            </w:r>
+          </w:p>
+        </w:tc>
+        <w:tc>
+          <w:tcPr>
+            <w:tcW w:w="3209" w:type="dxa"/>
+            <w:tcBorders>
+              <w:top w:val="single" w:sz="4" w:space="0" w:color="000000"/>
+              <w:left w:val="single" w:sz="4" w:space="0" w:color="000000"/>
+              <w:bottom w:val="single" w:sz="4" w:space="0" w:color="000000"/>
+              <w:right w:val="single" w:sz="4" w:space="0" w:color="000000"/>
+            </w:tcBorders>
+            <w:tcMar>
+              <w:top w:w="80" w:type="dxa"/>
+              <w:left w:w="80" w:type="dxa"/>
+              <w:bottom w:w="80" w:type="dxa"/>
+              <w:right w:w="80" w:type="dxa"/>
+            </w:tcMar>
+          </w:tcPr>
+          <w:p>
+            <w:pPr>
+              <w:rPr>
+                <w:sz w:val="22"/>
+                <w:szCs w:val="22"/>
+              </w:rPr>
+            </w:pPr>
+            <w:r>
+              <w:rPr>
+                <w:sz w:val="22"/>
+                <w:szCs w:val="22"/>
+              </w:rPr>
+              <w:t>This functionality</w:t>
+            </w:r>
+            <w:r>
+              <w:rPr>
+                <w:sz w:val="22"/>
+                <w:szCs w:val="22"/>
+              </w:rPr>
+              <w:t xml:space="preserve"> is essential as it </w:t>
+            </w:r>
+            <w:r>
+              <w:rPr>
+                <w:sz w:val="22"/>
+                <w:szCs w:val="22"/>
+              </w:rPr>
+              <w:t xml:space="preserve">records completed transactions and </w:t>
+            </w:r>
+            <w:r>
+              <w:rPr>
+                <w:sz w:val="22"/>
+                <w:szCs w:val="22"/>
+              </w:rPr>
+              <w:t>ensures</w:t>
+            </w:r>
+            <w:r>
+              <w:rPr>
+                <w:sz w:val="22"/>
+                <w:szCs w:val="22"/>
+              </w:rPr>
+              <w:t xml:space="preserve"> payments are properly tracked. </w:t>
+            </w:r>
+          </w:p>
+        </w:tc>
+      </w:tr>
+      <w:tr>
+        <w:trPr>
+          <w:trHeight w:val="241"/>
+        </w:trPr>
+        <w:tc>
+          <w:tcPr>
+            <w:tcW w:w="1179" w:type="dxa"/>
+            <w:tcBorders>
+              <w:top w:val="single" w:sz="4" w:space="0" w:color="000000"/>
+              <w:left w:val="single" w:sz="4" w:space="0" w:color="000000"/>
+              <w:bottom w:val="single" w:sz="4" w:space="0" w:color="000000"/>
+              <w:right w:val="single" w:sz="4" w:space="0" w:color="000000"/>
+            </w:tcBorders>
+            <w:tcMar>
+              <w:top w:w="80" w:type="dxa"/>
+              <w:left w:w="80" w:type="dxa"/>
+              <w:bottom w:w="80" w:type="dxa"/>
+              <w:right w:w="80" w:type="dxa"/>
+            </w:tcMar>
+          </w:tcPr>
+          <w:p>
+            <w:pPr>
+              <w:pStyle w:val="BodyText"/>
+            </w:pPr>
+            <w:r>
+              <w:t>UC33</w:t>
+            </w:r>
+          </w:p>
+        </w:tc>
+        <w:tc>
+          <w:tcPr>
+            <w:tcW w:w="3161" w:type="dxa"/>
+            <w:tcBorders>
+              <w:top w:val="single" w:sz="4" w:space="0" w:color="000000"/>
+              <w:left w:val="single" w:sz="4" w:space="0" w:color="000000"/>
+              <w:bottom w:val="single" w:sz="4" w:space="0" w:color="000000"/>
+              <w:right w:val="single" w:sz="4" w:space="0" w:color="000000"/>
+            </w:tcBorders>
+            <w:tcMar>
+              <w:top w:w="80" w:type="dxa"/>
+              <w:left w:w="80" w:type="dxa"/>
+              <w:bottom w:w="80" w:type="dxa"/>
+              <w:right w:w="80" w:type="dxa"/>
+            </w:tcMar>
+          </w:tcPr>
+          <w:p>
+            <w:pPr>
+              <w:pStyle w:val="BodyText"/>
+            </w:pPr>
+            <w:proofErr w:type="spellStart"/>
+            <w:r>
+              <w:t>RequestPromotion</w:t>
+            </w:r>
+            <w:proofErr w:type="spellEnd"/>
+          </w:p>
+        </w:tc>
+        <w:tc>
+          <w:tcPr>
+            <w:tcW w:w="1467" w:type="dxa"/>
+            <w:tcBorders>
+              <w:top w:val="single" w:sz="4" w:space="0" w:color="000000"/>
+              <w:left w:val="single" w:sz="4" w:space="0" w:color="000000"/>
+              <w:bottom w:val="single" w:sz="4" w:space="0" w:color="000000"/>
+              <w:right w:val="single" w:sz="4" w:space="0" w:color="000000"/>
+            </w:tcBorders>
+            <w:tcMar>
+              <w:top w:w="80" w:type="dxa"/>
+              <w:left w:w="80" w:type="dxa"/>
+              <w:bottom w:w="80" w:type="dxa"/>
+              <w:right w:w="80" w:type="dxa"/>
+            </w:tcMar>
+          </w:tcPr>
+          <w:p>
+            <w:pPr>
+              <w:pStyle w:val="BodyText"/>
+            </w:pPr>
+            <w:r>
+              <w:t>Important</w:t>
+            </w:r>
+          </w:p>
+        </w:tc>
+        <w:tc>
+          <w:tcPr>
+            <w:tcW w:w="3209" w:type="dxa"/>
+            <w:tcBorders>
+              <w:top w:val="single" w:sz="4" w:space="0" w:color="000000"/>
+              <w:left w:val="single" w:sz="4" w:space="0" w:color="000000"/>
+              <w:bottom w:val="single" w:sz="4" w:space="0" w:color="000000"/>
+              <w:right w:val="single" w:sz="4" w:space="0" w:color="000000"/>
+            </w:tcBorders>
+            <w:tcMar>
+              <w:top w:w="80" w:type="dxa"/>
+              <w:left w:w="80" w:type="dxa"/>
+              <w:bottom w:w="80" w:type="dxa"/>
+              <w:right w:w="80" w:type="dxa"/>
+            </w:tcMar>
+          </w:tcPr>
+          <w:p>
+            <w:pPr>
+              <w:rPr>
+                <w:sz w:val="22"/>
+                <w:szCs w:val="22"/>
+              </w:rPr>
+            </w:pPr>
+            <w:r>
+              <w:rPr>
+                <w:sz w:val="22"/>
+                <w:szCs w:val="22"/>
+              </w:rPr>
+              <w:t xml:space="preserve">This functionality supports the promotion workflow by allowing </w:t>
+            </w:r>
+            <w:r>
+              <w:rPr>
+                <w:sz w:val="22"/>
+                <w:szCs w:val="22"/>
+              </w:rPr>
+              <w:lastRenderedPageBreak/>
+              <w:t>promotions to be requested and managed.</w:t>
+            </w:r>
+          </w:p>
+        </w:tc>
+      </w:tr>
+      <w:tr>
+        <w:trPr>
+          <w:trHeight w:val="241"/>
+        </w:trPr>
+        <w:tc>
+          <w:tcPr>
+            <w:tcW w:w="1179" w:type="dxa"/>
+            <w:tcBorders>
+              <w:top w:val="single" w:sz="4" w:space="0" w:color="000000"/>
+              <w:left w:val="single" w:sz="4" w:space="0" w:color="000000"/>
+              <w:bottom w:val="single" w:sz="4" w:space="0" w:color="000000"/>
+              <w:right w:val="single" w:sz="4" w:space="0" w:color="000000"/>
+            </w:tcBorders>
+            <w:tcMar>
+              <w:top w:w="80" w:type="dxa"/>
+              <w:left w:w="80" w:type="dxa"/>
+              <w:bottom w:w="80" w:type="dxa"/>
+              <w:right w:w="80" w:type="dxa"/>
+            </w:tcMar>
+          </w:tcPr>
+          <w:p>
+            <w:pPr>
+              <w:pStyle w:val="BodyText"/>
+            </w:pPr>
+            <w:r>
+              <w:lastRenderedPageBreak/>
+              <w:t>UC34</w:t>
+            </w:r>
+          </w:p>
+        </w:tc>
+        <w:tc>
+          <w:tcPr>
+            <w:tcW w:w="3161" w:type="dxa"/>
+            <w:tcBorders>
+              <w:top w:val="single" w:sz="4" w:space="0" w:color="000000"/>
+              <w:left w:val="single" w:sz="4" w:space="0" w:color="000000"/>
+              <w:bottom w:val="single" w:sz="4" w:space="0" w:color="000000"/>
+              <w:right w:val="single" w:sz="4" w:space="0" w:color="000000"/>
+            </w:tcBorders>
+            <w:tcMar>
+              <w:top w:w="80" w:type="dxa"/>
+              <w:left w:w="80" w:type="dxa"/>
+              <w:bottom w:w="80" w:type="dxa"/>
+              <w:right w:w="80" w:type="dxa"/>
+            </w:tcMar>
+          </w:tcPr>
+          <w:p>
+            <w:pPr>
+              <w:pStyle w:val="BodyText"/>
+            </w:pPr>
+            <w:r>
+              <w:t>Access/</w:t>
+            </w:r>
+            <w:proofErr w:type="spellStart"/>
+            <w:r>
+              <w:t>UpdateSalesData</w:t>
+            </w:r>
+            <w:proofErr w:type="spellEnd"/>
+          </w:p>
+        </w:tc>
+        <w:tc>
+          <w:tcPr>
+            <w:tcW w:w="1467" w:type="dxa"/>
+            <w:tcBorders>
+              <w:top w:val="single" w:sz="4" w:space="0" w:color="000000"/>
+              <w:left w:val="single" w:sz="4" w:space="0" w:color="000000"/>
+              <w:bottom w:val="single" w:sz="4" w:space="0" w:color="000000"/>
+              <w:right w:val="single" w:sz="4" w:space="0" w:color="000000"/>
+            </w:tcBorders>
+            <w:tcMar>
+              <w:top w:w="80" w:type="dxa"/>
+              <w:left w:w="80" w:type="dxa"/>
+              <w:bottom w:w="80" w:type="dxa"/>
+              <w:right w:w="80" w:type="dxa"/>
+            </w:tcMar>
+          </w:tcPr>
+          <w:p>
+            <w:pPr>
+              <w:pStyle w:val="BodyText"/>
+            </w:pPr>
+            <w:r>
+              <w:t>Important</w:t>
+            </w:r>
+          </w:p>
+        </w:tc>
+        <w:tc>
+          <w:tcPr>
+            <w:tcW w:w="3209" w:type="dxa"/>
+            <w:tcBorders>
+              <w:top w:val="single" w:sz="4" w:space="0" w:color="000000"/>
+              <w:left w:val="single" w:sz="4" w:space="0" w:color="000000"/>
+              <w:bottom w:val="single" w:sz="4" w:space="0" w:color="000000"/>
+              <w:right w:val="single" w:sz="4" w:space="0" w:color="000000"/>
+            </w:tcBorders>
+            <w:tcMar>
+              <w:top w:w="80" w:type="dxa"/>
+              <w:left w:w="80" w:type="dxa"/>
+              <w:bottom w:w="80" w:type="dxa"/>
+              <w:right w:w="80" w:type="dxa"/>
+            </w:tcMar>
+          </w:tcPr>
+          <w:p>
+            <w:pPr>
+              <w:rPr>
+                <w:sz w:val="22"/>
+                <w:szCs w:val="22"/>
+              </w:rPr>
+            </w:pPr>
+            <w:r>
+              <w:rPr>
+                <w:color w:val="000000"/>
+                <w:sz w:val="22"/>
+                <w:szCs w:val="22"/>
+              </w:rPr>
+              <w:t>This functionality allows sales data to be maintained accurately for business tracking. It is important for monitoring sales performance</w:t>
+            </w:r>
+            <w:r>
+              <w:rPr>
+                <w:color w:val="000000"/>
+                <w:sz w:val="22"/>
+                <w:szCs w:val="22"/>
+              </w:rPr>
+              <w:t>.</w:t>
+            </w:r>
+          </w:p>
+        </w:tc>
+      </w:tr>
+      <w:tr>
+        <w:trPr>
+          <w:trHeight w:val="241"/>
+        </w:trPr>
+        <w:tc>
+          <w:tcPr>
+            <w:tcW w:w="1179" w:type="dxa"/>
+            <w:tcBorders>
+              <w:top w:val="single" w:sz="4" w:space="0" w:color="000000"/>
+              <w:left w:val="single" w:sz="4" w:space="0" w:color="000000"/>
+              <w:bottom w:val="single" w:sz="4" w:space="0" w:color="000000"/>
+              <w:right w:val="single" w:sz="4" w:space="0" w:color="000000"/>
+            </w:tcBorders>
+            <w:tcMar>
+              <w:top w:w="80" w:type="dxa"/>
+              <w:left w:w="80" w:type="dxa"/>
+              <w:bottom w:w="80" w:type="dxa"/>
+              <w:right w:w="80" w:type="dxa"/>
+            </w:tcMar>
+          </w:tcPr>
+          <w:p>
+            <w:pPr>
+              <w:pStyle w:val="BodyText"/>
+            </w:pPr>
+            <w:r>
+              <w:t>UC35</w:t>
+            </w:r>
+          </w:p>
+        </w:tc>
+        <w:tc>
+          <w:tcPr>
+            <w:tcW w:w="3161" w:type="dxa"/>
+            <w:tcBorders>
+              <w:top w:val="single" w:sz="4" w:space="0" w:color="000000"/>
+              <w:left w:val="single" w:sz="4" w:space="0" w:color="000000"/>
+              <w:bottom w:val="single" w:sz="4" w:space="0" w:color="000000"/>
+              <w:right w:val="single" w:sz="4" w:space="0" w:color="000000"/>
+            </w:tcBorders>
+            <w:tcMar>
+              <w:top w:w="80" w:type="dxa"/>
+              <w:left w:w="80" w:type="dxa"/>
+              <w:bottom w:w="80" w:type="dxa"/>
+              <w:right w:w="80" w:type="dxa"/>
+            </w:tcMar>
+          </w:tcPr>
+          <w:p>
+            <w:pPr>
+              <w:pStyle w:val="BodyText"/>
+            </w:pPr>
+            <w:proofErr w:type="spellStart"/>
+            <w:r>
+              <w:t>GeneratePromotionReport</w:t>
+            </w:r>
+            <w:proofErr w:type="spellEnd"/>
+          </w:p>
+        </w:tc>
+        <w:tc>
+          <w:tcPr>
+            <w:tcW w:w="1467" w:type="dxa"/>
+            <w:tcBorders>
+              <w:top w:val="single" w:sz="4" w:space="0" w:color="000000"/>
+              <w:left w:val="single" w:sz="4" w:space="0" w:color="000000"/>
+              <w:bottom w:val="single" w:sz="4" w:space="0" w:color="000000"/>
+              <w:right w:val="single" w:sz="4" w:space="0" w:color="000000"/>
+            </w:tcBorders>
+            <w:tcMar>
+              <w:top w:w="80" w:type="dxa"/>
+              <w:left w:w="80" w:type="dxa"/>
+              <w:bottom w:w="80" w:type="dxa"/>
+              <w:right w:w="80" w:type="dxa"/>
+            </w:tcMar>
+          </w:tcPr>
+          <w:p>
+            <w:pPr>
+              <w:pStyle w:val="BodyText"/>
+            </w:pPr>
+            <w:r>
+              <w:t>Good to have</w:t>
+            </w:r>
+          </w:p>
+        </w:tc>
+        <w:tc>
+          <w:tcPr>
+            <w:tcW w:w="3209" w:type="dxa"/>
+            <w:tcBorders>
+              <w:top w:val="single" w:sz="4" w:space="0" w:color="000000"/>
+              <w:left w:val="single" w:sz="4" w:space="0" w:color="000000"/>
+              <w:bottom w:val="single" w:sz="4" w:space="0" w:color="000000"/>
+              <w:right w:val="single" w:sz="4" w:space="0" w:color="000000"/>
+            </w:tcBorders>
+            <w:tcMar>
+              <w:top w:w="80" w:type="dxa"/>
+              <w:left w:w="80" w:type="dxa"/>
+              <w:bottom w:w="80" w:type="dxa"/>
+              <w:right w:w="80" w:type="dxa"/>
+            </w:tcMar>
+          </w:tcPr>
+          <w:p>
+            <w:pPr>
+              <w:rPr>
+                <w:sz w:val="22"/>
+                <w:szCs w:val="22"/>
+              </w:rPr>
+            </w:pPr>
+            <w:r>
+              <w:rPr>
+                <w:sz w:val="22"/>
+                <w:szCs w:val="22"/>
+              </w:rPr>
+              <w:t>This functionality generates reports that are useful for promotion analysis</w:t>
+            </w:r>
+            <w:r>
+              <w:rPr>
+                <w:sz w:val="22"/>
+                <w:szCs w:val="22"/>
+              </w:rPr>
+              <w:t>.</w:t>
+            </w:r>
+          </w:p>
+        </w:tc>
+      </w:tr>
+      <w:tr>
+        <w:trPr>
+          <w:trHeight w:val="241"/>
+        </w:trPr>
+        <w:tc>
+          <w:tcPr>
+            <w:tcW w:w="1179" w:type="dxa"/>
+            <w:tcBorders>
+              <w:top w:val="single" w:sz="4" w:space="0" w:color="000000"/>
+              <w:left w:val="single" w:sz="4" w:space="0" w:color="000000"/>
+              <w:bottom w:val="single" w:sz="4" w:space="0" w:color="000000"/>
+              <w:right w:val="single" w:sz="4" w:space="0" w:color="000000"/>
+            </w:tcBorders>
+            <w:tcMar>
+              <w:top w:w="80" w:type="dxa"/>
+              <w:left w:w="80" w:type="dxa"/>
+              <w:bottom w:w="80" w:type="dxa"/>
+              <w:right w:w="80" w:type="dxa"/>
+            </w:tcMar>
+          </w:tcPr>
+          <w:p>
+            <w:pPr>
+              <w:pStyle w:val="BodyText"/>
+            </w:pPr>
+            <w:r>
+              <w:t>UC36</w:t>
+            </w:r>
+          </w:p>
+        </w:tc>
+        <w:tc>
+          <w:tcPr>
+            <w:tcW w:w="3161" w:type="dxa"/>
+            <w:tcBorders>
+              <w:top w:val="single" w:sz="4" w:space="0" w:color="000000"/>
+              <w:left w:val="single" w:sz="4" w:space="0" w:color="000000"/>
+              <w:bottom w:val="single" w:sz="4" w:space="0" w:color="000000"/>
+              <w:right w:val="single" w:sz="4" w:space="0" w:color="000000"/>
+            </w:tcBorders>
+            <w:tcMar>
+              <w:top w:w="80" w:type="dxa"/>
+              <w:left w:w="80" w:type="dxa"/>
+              <w:bottom w:w="80" w:type="dxa"/>
+              <w:right w:w="80" w:type="dxa"/>
+            </w:tcMar>
+          </w:tcPr>
+          <w:p>
+            <w:pPr>
+              <w:pStyle w:val="BodyText"/>
+            </w:pPr>
+            <w:proofErr w:type="spellStart"/>
+            <w:r>
+              <w:t>GenerateClickReport</w:t>
+            </w:r>
+            <w:proofErr w:type="spellEnd"/>
+          </w:p>
+        </w:tc>
+        <w:tc>
+          <w:tcPr>
+            <w:tcW w:w="1467" w:type="dxa"/>
+            <w:tcBorders>
+              <w:top w:val="single" w:sz="4" w:space="0" w:color="000000"/>
+              <w:left w:val="single" w:sz="4" w:space="0" w:color="000000"/>
+              <w:bottom w:val="single" w:sz="4" w:space="0" w:color="000000"/>
+              <w:right w:val="single" w:sz="4" w:space="0" w:color="000000"/>
+            </w:tcBorders>
+            <w:tcMar>
+              <w:top w:w="80" w:type="dxa"/>
+              <w:left w:w="80" w:type="dxa"/>
+              <w:bottom w:w="80" w:type="dxa"/>
+              <w:right w:w="80" w:type="dxa"/>
+            </w:tcMar>
+          </w:tcPr>
+          <w:p>
+            <w:pPr>
+              <w:pStyle w:val="BodyText"/>
+            </w:pPr>
+            <w:r>
+              <w:t>Good to have</w:t>
+            </w:r>
+          </w:p>
+        </w:tc>
+        <w:tc>
+          <w:tcPr>
+            <w:tcW w:w="3209" w:type="dxa"/>
+            <w:tcBorders>
+              <w:top w:val="single" w:sz="4" w:space="0" w:color="000000"/>
+              <w:left w:val="single" w:sz="4" w:space="0" w:color="000000"/>
+              <w:bottom w:val="single" w:sz="4" w:space="0" w:color="000000"/>
+              <w:right w:val="single" w:sz="4" w:space="0" w:color="000000"/>
+            </w:tcBorders>
+            <w:tcMar>
+              <w:top w:w="80" w:type="dxa"/>
+              <w:left w:w="80" w:type="dxa"/>
+              <w:bottom w:w="80" w:type="dxa"/>
+              <w:right w:w="80" w:type="dxa"/>
+            </w:tcMar>
+          </w:tcPr>
+          <w:p>
+            <w:pPr>
+              <w:rPr>
+                <w:sz w:val="22"/>
+                <w:szCs w:val="22"/>
+              </w:rPr>
+            </w:pPr>
+            <w:r>
+              <w:rPr>
+                <w:sz w:val="22"/>
+                <w:szCs w:val="22"/>
+              </w:rPr>
+              <w:t xml:space="preserve">This functionality generates reports based on user interactions. It is useful for </w:t>
+            </w:r>
+            <w:proofErr w:type="spellStart"/>
+            <w:r>
+              <w:rPr>
+                <w:sz w:val="22"/>
+                <w:szCs w:val="22"/>
+              </w:rPr>
+              <w:t>analysing</w:t>
+            </w:r>
+            <w:proofErr w:type="spellEnd"/>
+            <w:r>
+              <w:rPr>
+                <w:sz w:val="22"/>
+                <w:szCs w:val="22"/>
+              </w:rPr>
+              <w:t xml:space="preserve"> user </w:t>
+            </w:r>
+            <w:proofErr w:type="spellStart"/>
+            <w:r>
+              <w:rPr>
+                <w:sz w:val="22"/>
+                <w:szCs w:val="22"/>
+              </w:rPr>
+              <w:t>behaviour</w:t>
+            </w:r>
+            <w:proofErr w:type="spellEnd"/>
+            <w:r>
+              <w:rPr>
+                <w:sz w:val="22"/>
+                <w:szCs w:val="22"/>
+              </w:rPr>
+              <w:t>, but it is not required for system functionality.</w:t>
+            </w:r>
+          </w:p>
+        </w:tc>
+      </w:tr>
+      <w:tr>
+        <w:trPr>
+          <w:trHeight w:val="241"/>
+        </w:trPr>
+        <w:tc>
+          <w:tcPr>
+            <w:tcW w:w="1179" w:type="dxa"/>
+            <w:tcBorders>
+              <w:top w:val="single" w:sz="4" w:space="0" w:color="000000"/>
+              <w:left w:val="single" w:sz="4" w:space="0" w:color="000000"/>
+              <w:bottom w:val="single" w:sz="4" w:space="0" w:color="000000"/>
+              <w:right w:val="single" w:sz="4" w:space="0" w:color="000000"/>
+            </w:tcBorders>
+            <w:tcMar>
+              <w:top w:w="80" w:type="dxa"/>
+              <w:left w:w="80" w:type="dxa"/>
+              <w:bottom w:w="80" w:type="dxa"/>
+              <w:right w:w="80" w:type="dxa"/>
+            </w:tcMar>
+          </w:tcPr>
+          <w:p>
+            <w:pPr>
+              <w:pStyle w:val="BodyText"/>
+            </w:pPr>
+            <w:r>
               <w:t>UC37</w:t>
             </w:r>
           </w:p>
@@ -4829,14 +5154,7 @@
                 <w:sz w:val="22"/>
                 <w:szCs w:val="22"/>
               </w:rPr>
-              <w:t xml:space="preserve"> </w:t>
-            </w:r>
-            <w:r>
-              <w:rPr>
-                <w:sz w:val="22"/>
-                <w:szCs w:val="22"/>
-              </w:rPr>
-              <w:t xml:space="preserve">and </w:t>
+              <w:t xml:space="preserve"> and </w:t>
             </w:r>
             <w:r>
               <w:rPr>
@@ -4859,14 +5177,7 @@
                 <w:sz w:val="22"/>
                 <w:szCs w:val="22"/>
               </w:rPr>
-              <w:t>Not necessary for system functionality</w:t>
-            </w:r>
-            <w:r>
-              <w:rPr>
-                <w:sz w:val="22"/>
-                <w:szCs w:val="22"/>
-              </w:rPr>
-              <w:t>.</w:t>
+              <w:t>Not necessary for system functionality.</w:t>
             </w:r>
           </w:p>
         </w:tc>

</xml_diff>